<commit_message>
Atualiza geração de relatórios e comentários do gestor
</commit_message>
<xml_diff>
--- a/03-Relatorios/01-Relatorio_Consolidado/Relatório_altaresolucao_novo.docx
+++ b/03-Relatorios/01-Relatorio_Consolidado/Relatório_altaresolucao_novo.docx
@@ -1711,58 +1711,52 @@
         <w:pStyle w:val="Corpodetexto"/>
       </w:pPr>
       <w:r>
-        <w:t xml:space="preserve">A ISO-IEC 38501:2015 estabelece o modelo de governança de TI, ilustrado na Figura 1, que apresenta as três atividades da governança: avaliar, dirigir e monitorar. Avaliar consiste em estabelecer o ambiente interno e externo e determinar como a organização é atualmente apoiada e habilitada por meio do uso de TI. Dirigir significa definir como a organização deve ser apoiada e habilitada por meio do uso adequado da TI. Por fim, monitorar é a atividade que verifica se o que foi planejado e direcionado está realmente sendo executado.</w:t>
+        <w:t>A ABNT NBR ISO/IEC 38500:2025 estabelece o modelo de governança de TI, ilustrado na Figura 1, que apresenta as três atividades da governança: avaliar, dirigir e monitorar. Avaliar consiste em estabelecer o ambiente interno e externo e determinar como a organização é atualmente apoiada e habilitada por meio do uso de TI. Dirigir significa definir como a organização deve ser apoiada e habilitada por meio do uso adequado da TI. Por fim, monitorar é a atividade que verifica se o que foi planejado e direcionado está realmente sendo executado.</w:t>
       </w:r>
     </w:p>
     <w:p>
       <w:pPr>
         <w:pStyle w:val="Corpodetexto"/>
         <w:keepNext/>
-      </w:pPr>
-      <w:r>
-        <w:t xml:space="preserve">Figura 1 - Modelo de Governança de TI</w:t>
+        <w:jc w:val="center"/>
+      </w:pPr>
+      <w:r>
+        <w:t>Figura 1 - Modelo de Governança de TI segundo a ISO/IEC 38500</w:t>
       </w:r>
     </w:p>
     <w:p>
       <w:pPr>
         <w:pStyle w:val="Corpodetexto"/>
         <w:keepNext/>
+        <w:jc w:val="center"/>
       </w:pPr>
       <w:r>
         <w:drawing>
           <wp:inline>
-            <wp:extent cx="3810000" cy="2540000"/>
-            <wp:effectExtent b="0" l="0" r="0" t="0"/>
-            <wp:docPr descr="" title="" id="32" name="Picture"/>
+            <wp:extent cx="5580000" cy="3661875"/>
+            <wp:docPr id="89" name="Picture 89"/>
+            <wp:cNvGraphicFramePr>
+              <a:graphicFrameLocks noChangeAspect="1"/>
+            </wp:cNvGraphicFramePr>
             <a:graphic>
               <a:graphicData uri="http://schemas.openxmlformats.org/drawingml/2006/picture">
                 <pic:pic>
                   <pic:nvPicPr>
-                    <pic:cNvPr descr="data:image/png;base64..." id="33" name="Picture"/>
-                    <pic:cNvPicPr>
-                      <a:picLocks noChangeArrowheads="1" noChangeAspect="1"/>
-                    </pic:cNvPicPr>
+                    <pic:cNvPr id="0" name="modelo_governanca_ti_iso_38500.png"/>
+                    <pic:cNvPicPr/>
                   </pic:nvPicPr>
                   <pic:blipFill>
-                    <a:blip r:embed="rId31"/>
+                    <a:blip r:embed="rId1"/>
                     <a:stretch>
                       <a:fillRect/>
                     </a:stretch>
                   </pic:blipFill>
-                  <pic:spPr bwMode="auto">
+                  <pic:spPr>
                     <a:xfrm>
                       <a:off x="0" y="0"/>
-                      <a:ext cx="3810000" cy="2540000"/>
+                      <a:ext cx="5580000" cy="3661875"/>
                     </a:xfrm>
-                    <a:prstGeom prst="rect">
-                      <a:avLst/>
-                    </a:prstGeom>
-                    <a:noFill/>
-                    <a:ln w="9525">
-                      <a:noFill/>
-                      <a:headEnd/>
-                      <a:tailEnd/>
-                    </a:ln>
+                    <a:prstGeom prst="rect"/>
                   </pic:spPr>
                 </pic:pic>
               </a:graphicData>
@@ -1774,9 +1768,10 @@
     <w:p>
       <w:pPr>
         <w:pStyle w:val="Corpodetexto"/>
-      </w:pPr>
-      <w:r>
-        <w:t xml:space="preserve">(Fonte: Adaptado de ISO-IEC 38501:2015)</w:t>
+        <w:jc w:val="center"/>
+      </w:pPr>
+      <w:r>
+        <w:t>(Fonte: elaboração própria, adaptado da ABNT NBR ISO/IEC 38500:2025)</w:t>
       </w:r>
     </w:p>
     <w:bookmarkStart w:id="34" w:name="X5cfc502d14c8b72587b8734643dd6f6e170562a"/>

</xml_diff>

<commit_message>
Atualiza AN10 e tratamento das respostas inválidas
</commit_message>
<xml_diff>
--- a/03-Relatorios/01-Relatorio_Consolidado/Relatório_altaresolucao_novo.docx
+++ b/03-Relatorios/01-Relatorio_Consolidado/Relatório_altaresolucao_novo.docx
@@ -1110,7 +1110,7 @@
                 <w:bCs/>
                 <w:sz w:val="18"/>
               </w:rPr>
-              <w:t xml:space="preserve">Comunicações da fiscalização e registros de ciência dos não respondentes</w:t>
+              <w:t xml:space="preserve">Comunicações da fiscalização e registros de ciência das organizações sem resposta válida</w:t>
             </w:r>
             <w:r>
               <w:rPr>
@@ -1124,7 +1124,7 @@
                 <w:rFonts w:ascii="Calibri" w:hAnsi="Calibri"/>
                 <w:sz w:val="18"/>
               </w:rPr>
-              <w:t xml:space="preserve">(arquivo digital “AN10 – Comunicações da fiscalização e registros de ciência dos não respondentes.pdf”)</w:t>
+              <w:t xml:space="preserve">(arquivo digital “AN10 – Comunicações da fiscalização e registros de ciência dos não respondentes.zip”)</w:t>
             </w:r>
           </w:p>
         </w:tc>
@@ -1277,7 +1277,7 @@
         <w:pStyle w:val="Corpodetexto"/>
       </w:pPr>
       <w:r>
-        <w:t xml:space="preserve">A fiscalização abrangeu 119 organizações, sendo 35 prefeituras e 84 organizações estaduais de diferentes poderes e naturezas jurídicas. Destas, 113 responderam ao questionário e integraram o cálculo do iGovTI e os achados consolidados. As outras 6 foram classificadas como não respondentes e tratadas separadamente.</w:t>
+        <w:t xml:space="preserve">A fiscalização abrangeu 119 organizações, sendo 35 prefeituras e 84 organizações estaduais de diferentes poderes e naturezas jurídicas. Destas, 113 concluíram e submeteram resposta válida ao questionário e integraram o cálculo do iGovTI e os achados consolidados. As outras seis não apresentaram resposta válida e foram tratadas separadamente. Entre elas, a EMOP iniciou o preenchimento e anexou documentos, mas não concluiu nem submeteu o questionário.</w:t>
       </w:r>
     </w:p>
     <w:p>
@@ -1617,7 +1617,7 @@
         <w:pStyle w:val="FirstParagraph"/>
       </w:pPr>
       <w:r>
-        <w:t xml:space="preserve">Propõem-se, ainda, a abertura de processos apartados para apurar as circunstâncias da ausência de resposta válida das seis organizações não respondentes, a comunicação das unidades de controle interno para acompanhamento dos planos de ação e o arquivamento do processo após as comunicações.</w:t>
+        <w:t xml:space="preserve">Propõem-se, ainda, a abertura de processos apartados para apurar, de forma individualizada, as circunstâncias da ausência de resposta válida das seis organizações, inclusive a resposta parcial da EMOP e os esclarecimentos apresentados pela EMOP e pela SESP, a comunicação das unidades de controle interno para acompanhamento dos planos de ação e o arquivamento do processo após as comunicações.</w:t>
       </w:r>
     </w:p>
     <w:p>
@@ -1916,7 +1916,7 @@
         <w:pStyle w:val="Corpodetexto"/>
       </w:pPr>
       <w:r>
-        <w:t xml:space="preserve">O escopo abrangeu 119 organizações, sendo 84 organizações estaduais de diferentes poderes e naturezas jurídicas e 35 prefeituras municipais. Desse total, 113 (cento e treze) apresentaram resposta válida ao questionário e foram consideradas nos resultados do iGovTI e nos achados consolidados. As seis organizações sem resposta válida foram tratadas como não respondentes. O período de execução dos trabalhos de campo ocorreu entre fevereiro e julho de 2026.</w:t>
+        <w:t xml:space="preserve">O escopo abrangeu 119 organizações, sendo 84 organizações estaduais de diferentes poderes e naturezas jurídicas e 35 prefeituras municipais. Desse total, 113 (cento e treze) concluíram e submeteram resposta válida ao questionário e foram consideradas nos resultados do iGovTI e nos achados consolidados. As seis organizações sem resposta válida foram tratadas separadamente; a EMOP iniciou o preenchimento, mas não concluiu nem submeteu o questionário. O período de execução dos trabalhos de campo ocorreu entre fevereiro e julho de 2026.</w:t>
       </w:r>
     </w:p>
     <w:p>
@@ -2076,7 +2076,7 @@
         <w:t xml:space="preserve"> </w:t>
       </w:r>
       <w:r>
-        <w:t xml:space="preserve">— CSA): cada gestor informou o nível de adoção das práticas avaliadas e, quando aplicável, anexou documentos para comprovar a resposta. Dos 119 jurisdicionados abrangidos no escopo, 113 apresentaram resposta válida e integraram as análises estatísticas e os achados consolidados. Os seis casos sem resposta válida foram classificados como não respondentes.</w:t>
+        <w:t xml:space="preserve">— CSA): cada gestor informou o nível de adoção das práticas avaliadas e, quando aplicável, anexou documentos para comprovar a resposta. Dos 119 jurisdicionados abrangidos no escopo, 113 concluíram e submeteram resposta válida e integraram as análises estatísticas e os achados consolidados. Nos seis casos sem resposta válida, os eventuais registros não concluídos não foram tratados como declarações definitivas nem utilizados no cálculo do índice; a EMOP possuía registro parcial, sem data de submissão final.</w:t>
       </w:r>
     </w:p>
     <w:p>
@@ -2270,7 +2270,7 @@
         <w:pStyle w:val="Corpodetexto"/>
       </w:pPr>
       <w:r>
-        <w:t xml:space="preserve">Com base no cenário pós-avaliação de evidências, foram elaborados os relatórios individuais preliminares que foram remetidos aos auditados para etapa de comentários do gestor. Esses relatórios apresentaram a nota do iGovTI, a posição relativa no conjunto de jurisdicionados, os achados identificados, as situações encontradas, os ajustes decorrentes da análise documental e o plano de ação proposto. Para os não respondentes, foi registrada a ausência de resposta válida.</w:t>
+        <w:t xml:space="preserve">Com base no cenário pós-avaliação de evidências, foram elaborados os relatórios individuais preliminares que foram remetidos aos auditados para etapa de comentários do gestor. Esses relatórios apresentaram a nota do iGovTI, a posição relativa no conjunto de jurisdicionados, os achados identificados, as situações encontradas, os ajustes decorrentes da análise documental e o plano de ação proposto. Para as organizações sem resposta válida, foi registrada essa circunstância.</w:t>
       </w:r>
     </w:p>
     <w:p>
@@ -2344,7 +2344,7 @@
         <w:pStyle w:val="Corpodetexto"/>
       </w:pPr>
       <w:r>
-        <w:t xml:space="preserve">O escopo abrangeu 119 organizações jurisdicionadas, sendo 84 organizações estaduais de diferentes poderes e naturezas jurídicas e 35 prefeituras municipais. Desse total, 113 apresentaram resposta válida ao questionário e integraram as análises de maturidade e os achados consolidados. As outras 6 foram classificadas como não respondentes, conforme registrado na Introdução.</w:t>
+        <w:t xml:space="preserve">O escopo abrangeu 119 organizações jurisdicionadas, sendo 84 organizações estaduais de diferentes poderes e naturezas jurídicas e 35 prefeituras municipais. Desse total, 113 apresentaram resposta válida ao questionário e integraram as análises de maturidade e os achados consolidados. As outras seis não apresentaram resposta válida, conforme registrado na Introdução.</w:t>
       </w:r>
     </w:p>
     <w:p>
@@ -5488,6 +5488,7 @@
           <w:p>
             <w:pPr>
               <w:pStyle w:val="Compact"/>
+              <w:keepNext/>
               <w:jc w:val="both"/>
             </w:pPr>
             <w:r>
@@ -5504,6 +5505,7 @@
           <w:p>
             <w:pPr>
               <w:pStyle w:val="Compact"/>
+              <w:keepNext/>
               <w:jc w:val="both"/>
             </w:pPr>
             <w:r>
@@ -5520,6 +5522,7 @@
           <w:p>
             <w:pPr>
               <w:pStyle w:val="Compact"/>
+              <w:keepNext/>
               <w:jc w:val="both"/>
             </w:pPr>
             <w:r>
@@ -5536,6 +5539,7 @@
           <w:p>
             <w:pPr>
               <w:pStyle w:val="Compact"/>
+              <w:keepNext/>
               <w:jc w:val="both"/>
             </w:pPr>
             <w:r>
@@ -5552,6 +5556,7 @@
           <w:p>
             <w:pPr>
               <w:pStyle w:val="Compact"/>
+              <w:keepNext/>
               <w:jc w:val="both"/>
             </w:pPr>
             <w:r>
@@ -5568,6 +5573,7 @@
           <w:p>
             <w:pPr>
               <w:pStyle w:val="Compact"/>
+              <w:keepNext/>
               <w:jc w:val="both"/>
             </w:pPr>
             <w:r>
@@ -5576,214 +5582,6 @@
                 <w:sz w:val="20"/>
               </w:rPr>
               <w:t xml:space="preserve">Média de Gestão</w:t>
-            </w:r>
-          </w:p>
-        </w:tc>
-      </w:tr>
-      <w:tr>
-        <w:trPr>
-          <w:cantSplit/>
-        </w:trPr>
-        <w:tc>
-          <w:tcPr/>
-          <w:p>
-            <w:pPr>
-              <w:pStyle w:val="Compact"/>
-              <w:jc w:val="both"/>
-            </w:pPr>
-            <w:r>
-              <w:rPr>
-                <w:rFonts w:ascii="Calibri" w:hAnsi="Calibri"/>
-                <w:sz w:val="18"/>
-              </w:rPr>
-              <w:t xml:space="preserve">Organizações estaduais</w:t>
-            </w:r>
-          </w:p>
-        </w:tc>
-        <w:tc>
-          <w:tcPr/>
-          <w:p>
-            <w:pPr>
-              <w:pStyle w:val="Compact"/>
-              <w:jc w:val="both"/>
-            </w:pPr>
-            <w:r>
-              <w:rPr>
-                <w:rFonts w:ascii="Calibri" w:hAnsi="Calibri"/>
-                <w:sz w:val="18"/>
-              </w:rPr>
-              <w:t xml:space="preserve">78</w:t>
-            </w:r>
-          </w:p>
-        </w:tc>
-        <w:tc>
-          <w:tcPr/>
-          <w:p>
-            <w:pPr>
-              <w:pStyle w:val="Compact"/>
-              <w:jc w:val="both"/>
-            </w:pPr>
-            <w:r>
-              <w:rPr>
-                <w:rFonts w:ascii="Calibri" w:hAnsi="Calibri"/>
-                <w:sz w:val="18"/>
-              </w:rPr>
-              <w:t xml:space="preserve">0,220</w:t>
-            </w:r>
-          </w:p>
-        </w:tc>
-        <w:tc>
-          <w:tcPr/>
-          <w:p>
-            <w:pPr>
-              <w:pStyle w:val="Compact"/>
-              <w:jc w:val="both"/>
-            </w:pPr>
-            <w:r>
-              <w:rPr>
-                <w:rFonts w:ascii="Calibri" w:hAnsi="Calibri"/>
-                <w:sz w:val="18"/>
-              </w:rPr>
-              <w:t xml:space="preserve">0,152</w:t>
-            </w:r>
-          </w:p>
-        </w:tc>
-        <w:tc>
-          <w:tcPr/>
-          <w:p>
-            <w:pPr>
-              <w:pStyle w:val="Compact"/>
-              <w:jc w:val="both"/>
-            </w:pPr>
-            <w:r>
-              <w:rPr>
-                <w:rFonts w:ascii="Calibri" w:hAnsi="Calibri"/>
-                <w:sz w:val="18"/>
-              </w:rPr>
-              <w:t xml:space="preserve">0,187</w:t>
-            </w:r>
-          </w:p>
-        </w:tc>
-        <w:tc>
-          <w:tcPr/>
-          <w:p>
-            <w:pPr>
-              <w:pStyle w:val="Compact"/>
-              <w:jc w:val="both"/>
-            </w:pPr>
-            <w:r>
-              <w:rPr>
-                <w:rFonts w:ascii="Calibri" w:hAnsi="Calibri"/>
-                <w:sz w:val="18"/>
-              </w:rPr>
-              <w:t xml:space="preserve">0,251</w:t>
-            </w:r>
-          </w:p>
-        </w:tc>
-      </w:tr>
-      <w:tr>
-        <w:trPr>
-          <w:cantSplit/>
-        </w:trPr>
-        <w:tc>
-          <w:tcPr/>
-          <w:p>
-            <w:pPr>
-              <w:pStyle w:val="Compact"/>
-              <w:keepNext/>
-              <w:jc w:val="both"/>
-            </w:pPr>
-            <w:r>
-              <w:rPr>
-                <w:rFonts w:ascii="Calibri" w:hAnsi="Calibri"/>
-                <w:sz w:val="18"/>
-              </w:rPr>
-              <w:t xml:space="preserve">Municípios</w:t>
-            </w:r>
-          </w:p>
-        </w:tc>
-        <w:tc>
-          <w:tcPr/>
-          <w:p>
-            <w:pPr>
-              <w:pStyle w:val="Compact"/>
-              <w:keepNext/>
-              <w:jc w:val="both"/>
-            </w:pPr>
-            <w:r>
-              <w:rPr>
-                <w:rFonts w:ascii="Calibri" w:hAnsi="Calibri"/>
-                <w:sz w:val="18"/>
-              </w:rPr>
-              <w:t xml:space="preserve">35</w:t>
-            </w:r>
-          </w:p>
-        </w:tc>
-        <w:tc>
-          <w:tcPr/>
-          <w:p>
-            <w:pPr>
-              <w:pStyle w:val="Compact"/>
-              <w:keepNext/>
-              <w:jc w:val="both"/>
-            </w:pPr>
-            <w:r>
-              <w:rPr>
-                <w:rFonts w:ascii="Calibri" w:hAnsi="Calibri"/>
-                <w:sz w:val="18"/>
-              </w:rPr>
-              <w:t xml:space="preserve">0,120</w:t>
-            </w:r>
-          </w:p>
-        </w:tc>
-        <w:tc>
-          <w:tcPr/>
-          <w:p>
-            <w:pPr>
-              <w:pStyle w:val="Compact"/>
-              <w:keepNext/>
-              <w:jc w:val="both"/>
-            </w:pPr>
-            <w:r>
-              <w:rPr>
-                <w:rFonts w:ascii="Calibri" w:hAnsi="Calibri"/>
-                <w:sz w:val="18"/>
-              </w:rPr>
-              <w:t xml:space="preserve">0,077</w:t>
-            </w:r>
-          </w:p>
-        </w:tc>
-        <w:tc>
-          <w:tcPr/>
-          <w:p>
-            <w:pPr>
-              <w:pStyle w:val="Compact"/>
-              <w:keepNext/>
-              <w:jc w:val="both"/>
-            </w:pPr>
-            <w:r>
-              <w:rPr>
-                <w:rFonts w:ascii="Calibri" w:hAnsi="Calibri"/>
-                <w:sz w:val="18"/>
-              </w:rPr>
-              <w:t xml:space="preserve">0,120</w:t>
-            </w:r>
-          </w:p>
-        </w:tc>
-        <w:tc>
-          <w:tcPr/>
-          <w:p>
-            <w:pPr>
-              <w:pStyle w:val="Compact"/>
-              <w:keepNext/>
-              <w:jc w:val="both"/>
-            </w:pPr>
-            <w:r>
-              <w:rPr>
-                <w:rFonts w:ascii="Calibri" w:hAnsi="Calibri"/>
-                <w:sz w:val="18"/>
-              </w:rPr>
-              <w:t xml:space="preserve">0,119</w:t>
             </w:r>
           </w:p>
         </w:tc>
@@ -5851,7 +5649,7 @@
     <w:tbl>
       <w:tblPr>
         <w:tblStyle w:val="Table"/>
-        <w:tblW w:type="pct" w:w="5000"/>
+        <w:tblW w:type="auto" w:w="0"/>
         <w:jc w:val="center"/>
         <w:tblLayout w:type="autofit"/>
         <w:tblLook w:firstRow="1" w:lastRow="0" w:firstColumn="0" w:lastColumn="0" w:noHBand="0" w:noVBand="0" w:val="0020"/>
@@ -5873,6 +5671,7 @@
           <w:p>
             <w:pPr>
               <w:pStyle w:val="Compact"/>
+              <w:keepNext/>
               <w:jc w:val="both"/>
             </w:pPr>
             <w:r>
@@ -5889,6 +5688,7 @@
           <w:p>
             <w:pPr>
               <w:pStyle w:val="Compact"/>
+              <w:keepNext/>
               <w:jc w:val="both"/>
             </w:pPr>
             <w:r>
@@ -5905,6 +5705,7 @@
           <w:p>
             <w:pPr>
               <w:pStyle w:val="Compact"/>
+              <w:keepNext/>
               <w:jc w:val="both"/>
             </w:pPr>
             <w:r>
@@ -5921,6 +5722,7 @@
           <w:p>
             <w:pPr>
               <w:pStyle w:val="Compact"/>
+              <w:keepNext/>
               <w:jc w:val="both"/>
             </w:pPr>
             <w:r>
@@ -5929,700 +5731,6 @@
                 <w:sz w:val="20"/>
               </w:rPr>
               <w:t xml:space="preserve">Não se aplica</w:t>
-            </w:r>
-          </w:p>
-        </w:tc>
-      </w:tr>
-      <w:tr>
-        <w:trPr>
-          <w:cantSplit/>
-        </w:trPr>
-        <w:tc>
-          <w:tcPr/>
-          <w:p>
-            <w:pPr>
-              <w:pStyle w:val="Compact"/>
-              <w:jc w:val="both"/>
-            </w:pPr>
-            <w:r>
-              <w:rPr>
-                <w:rFonts w:ascii="Calibri" w:hAnsi="Calibri"/>
-                <w:sz w:val="18"/>
-              </w:rPr>
-              <w:t xml:space="preserve">Maior adoção</w:t>
-            </w:r>
-          </w:p>
-        </w:tc>
-        <w:tc>
-          <w:tcPr/>
-          <w:p>
-            <w:pPr>
-              <w:pStyle w:val="Compact"/>
-              <w:jc w:val="both"/>
-            </w:pPr>
-            <w:r>
-              <w:rPr>
-                <w:rFonts w:ascii="Calibri" w:hAnsi="Calibri"/>
-                <w:sz w:val="18"/>
-              </w:rPr>
-              <w:t xml:space="preserve">2401. A organização dispõe de uma política de segurança da informação.</w:t>
-            </w:r>
-          </w:p>
-        </w:tc>
-        <w:tc>
-          <w:tcPr/>
-          <w:p>
-            <w:pPr>
-              <w:pStyle w:val="Compact"/>
-              <w:jc w:val="both"/>
-            </w:pPr>
-            <w:r>
-              <w:rPr>
-                <w:rFonts w:ascii="Calibri" w:hAnsi="Calibri"/>
-                <w:sz w:val="18"/>
-              </w:rPr>
-              <w:t xml:space="preserve">0,338</w:t>
-            </w:r>
-          </w:p>
-        </w:tc>
-        <w:tc>
-          <w:tcPr/>
-          <w:p>
-            <w:pPr>
-              <w:pStyle w:val="Compact"/>
-              <w:jc w:val="both"/>
-            </w:pPr>
-            <w:r>
-              <w:rPr>
-                <w:rFonts w:ascii="Calibri" w:hAnsi="Calibri"/>
-                <w:sz w:val="18"/>
-              </w:rPr>
-              <w:t xml:space="preserve">4</w:t>
-            </w:r>
-          </w:p>
-        </w:tc>
-      </w:tr>
-      <w:tr>
-        <w:trPr>
-          <w:cantSplit/>
-        </w:trPr>
-        <w:tc>
-          <w:tcPr/>
-          <w:p>
-            <w:pPr>
-              <w:pStyle w:val="Compact"/>
-              <w:jc w:val="both"/>
-            </w:pPr>
-            <w:r>
-              <w:rPr>
-                <w:rFonts w:ascii="Calibri" w:hAnsi="Calibri"/>
-                <w:sz w:val="18"/>
-              </w:rPr>
-              <w:t xml:space="preserve">Maior adoção</w:t>
-            </w:r>
-          </w:p>
-        </w:tc>
-        <w:tc>
-          <w:tcPr/>
-          <w:p>
-            <w:pPr>
-              <w:pStyle w:val="Compact"/>
-              <w:jc w:val="both"/>
-            </w:pPr>
-            <w:r>
-              <w:rPr>
-                <w:rFonts w:ascii="Calibri" w:hAnsi="Calibri"/>
-                <w:sz w:val="18"/>
-              </w:rPr>
-              <w:t xml:space="preserve">2101. A organização executa processo de planejamento de tecnologia da informação.</w:t>
-            </w:r>
-          </w:p>
-        </w:tc>
-        <w:tc>
-          <w:tcPr/>
-          <w:p>
-            <w:pPr>
-              <w:pStyle w:val="Compact"/>
-              <w:jc w:val="both"/>
-            </w:pPr>
-            <w:r>
-              <w:rPr>
-                <w:rFonts w:ascii="Calibri" w:hAnsi="Calibri"/>
-                <w:sz w:val="18"/>
-              </w:rPr>
-              <w:t xml:space="preserve">0,314</w:t>
-            </w:r>
-          </w:p>
-        </w:tc>
-        <w:tc>
-          <w:tcPr/>
-          <w:p>
-            <w:pPr>
-              <w:pStyle w:val="Compact"/>
-              <w:jc w:val="both"/>
-            </w:pPr>
-            <w:r>
-              <w:rPr>
-                <w:rFonts w:ascii="Calibri" w:hAnsi="Calibri"/>
-                <w:sz w:val="18"/>
-              </w:rPr>
-              <w:t xml:space="preserve">1</w:t>
-            </w:r>
-          </w:p>
-        </w:tc>
-      </w:tr>
-      <w:tr>
-        <w:trPr>
-          <w:cantSplit/>
-        </w:trPr>
-        <w:tc>
-          <w:tcPr/>
-          <w:p>
-            <w:pPr>
-              <w:pStyle w:val="Compact"/>
-              <w:jc w:val="both"/>
-            </w:pPr>
-            <w:r>
-              <w:rPr>
-                <w:rFonts w:ascii="Calibri" w:hAnsi="Calibri"/>
-                <w:sz w:val="18"/>
-              </w:rPr>
-              <w:t xml:space="preserve">Maior adoção</w:t>
-            </w:r>
-          </w:p>
-        </w:tc>
-        <w:tc>
-          <w:tcPr/>
-          <w:p>
-            <w:pPr>
-              <w:pStyle w:val="Compact"/>
-              <w:jc w:val="both"/>
-            </w:pPr>
-            <w:r>
-              <w:rPr>
-                <w:rFonts w:ascii="Calibri" w:hAnsi="Calibri"/>
-                <w:sz w:val="18"/>
-              </w:rPr>
-              <w:t xml:space="preserve">2102. A organização possui plano de tecnologia da informação vigente.</w:t>
-            </w:r>
-          </w:p>
-        </w:tc>
-        <w:tc>
-          <w:tcPr/>
-          <w:p>
-            <w:pPr>
-              <w:pStyle w:val="Compact"/>
-              <w:jc w:val="both"/>
-            </w:pPr>
-            <w:r>
-              <w:rPr>
-                <w:rFonts w:ascii="Calibri" w:hAnsi="Calibri"/>
-                <w:sz w:val="18"/>
-              </w:rPr>
-              <w:t xml:space="preserve">0,296</w:t>
-            </w:r>
-          </w:p>
-        </w:tc>
-        <w:tc>
-          <w:tcPr/>
-          <w:p>
-            <w:pPr>
-              <w:pStyle w:val="Compact"/>
-              <w:jc w:val="both"/>
-            </w:pPr>
-            <w:r>
-              <w:rPr>
-                <w:rFonts w:ascii="Calibri" w:hAnsi="Calibri"/>
-                <w:sz w:val="18"/>
-              </w:rPr>
-              <w:t xml:space="preserve">2</w:t>
-            </w:r>
-          </w:p>
-        </w:tc>
-      </w:tr>
-      <w:tr>
-        <w:trPr>
-          <w:cantSplit/>
-        </w:trPr>
-        <w:tc>
-          <w:tcPr/>
-          <w:p>
-            <w:pPr>
-              <w:pStyle w:val="Compact"/>
-              <w:jc w:val="both"/>
-            </w:pPr>
-            <w:r>
-              <w:rPr>
-                <w:rFonts w:ascii="Calibri" w:hAnsi="Calibri"/>
-                <w:sz w:val="18"/>
-              </w:rPr>
-              <w:t xml:space="preserve">Maior adoção</w:t>
-            </w:r>
-          </w:p>
-        </w:tc>
-        <w:tc>
-          <w:tcPr/>
-          <w:p>
-            <w:pPr>
-              <w:pStyle w:val="Compact"/>
-              <w:jc w:val="both"/>
-            </w:pPr>
-            <w:r>
-              <w:rPr>
-                <w:rFonts w:ascii="Calibri" w:hAnsi="Calibri"/>
-                <w:sz w:val="18"/>
-              </w:rPr>
-              <w:t xml:space="preserve">2501/2502. Gestão de ativos associados à informação e controle de acesso, conforme composição prevista na metodologia.</w:t>
-            </w:r>
-          </w:p>
-        </w:tc>
-        <w:tc>
-          <w:tcPr/>
-          <w:p>
-            <w:pPr>
-              <w:pStyle w:val="Compact"/>
-              <w:jc w:val="both"/>
-            </w:pPr>
-            <w:r>
-              <w:rPr>
-                <w:rFonts w:ascii="Calibri" w:hAnsi="Calibri"/>
-                <w:sz w:val="18"/>
-              </w:rPr>
-              <w:t xml:space="preserve">0,241</w:t>
-            </w:r>
-          </w:p>
-        </w:tc>
-        <w:tc>
-          <w:tcPr/>
-          <w:p>
-            <w:pPr>
-              <w:pStyle w:val="Compact"/>
-              <w:jc w:val="both"/>
-            </w:pPr>
-            <w:r>
-              <w:rPr>
-                <w:rFonts w:ascii="Calibri" w:hAnsi="Calibri"/>
-                <w:sz w:val="18"/>
-              </w:rPr>
-              <w:t xml:space="preserve">1</w:t>
-            </w:r>
-          </w:p>
-        </w:tc>
-      </w:tr>
-      <w:tr>
-        <w:trPr>
-          <w:cantSplit/>
-        </w:trPr>
-        <w:tc>
-          <w:tcPr/>
-          <w:p>
-            <w:pPr>
-              <w:pStyle w:val="Compact"/>
-              <w:jc w:val="both"/>
-            </w:pPr>
-            <w:r>
-              <w:rPr>
-                <w:rFonts w:ascii="Calibri" w:hAnsi="Calibri"/>
-                <w:sz w:val="18"/>
-              </w:rPr>
-              <w:t xml:space="preserve">Maior adoção</w:t>
-            </w:r>
-          </w:p>
-        </w:tc>
-        <w:tc>
-          <w:tcPr/>
-          <w:p>
-            <w:pPr>
-              <w:pStyle w:val="Compact"/>
-              <w:jc w:val="both"/>
-            </w:pPr>
-            <w:r>
-              <w:rPr>
-                <w:rFonts w:ascii="Calibri" w:hAnsi="Calibri"/>
-                <w:sz w:val="18"/>
-              </w:rPr>
-              <w:t xml:space="preserve">2504. A organização executa atividades de gestão da segurança dos recursos de processamento da informação, inclusive dos recursos de computação em nuvem.</w:t>
-            </w:r>
-          </w:p>
-        </w:tc>
-        <w:tc>
-          <w:tcPr/>
-          <w:p>
-            <w:pPr>
-              <w:pStyle w:val="Compact"/>
-              <w:jc w:val="both"/>
-            </w:pPr>
-            <w:r>
-              <w:rPr>
-                <w:rFonts w:ascii="Calibri" w:hAnsi="Calibri"/>
-                <w:sz w:val="18"/>
-              </w:rPr>
-              <w:t xml:space="preserve">0,238</w:t>
-            </w:r>
-          </w:p>
-        </w:tc>
-        <w:tc>
-          <w:tcPr/>
-          <w:p>
-            <w:pPr>
-              <w:pStyle w:val="Compact"/>
-              <w:jc w:val="both"/>
-            </w:pPr>
-            <w:r>
-              <w:rPr>
-                <w:rFonts w:ascii="Calibri" w:hAnsi="Calibri"/>
-                <w:sz w:val="18"/>
-              </w:rPr>
-              <w:t xml:space="preserve">4</w:t>
-            </w:r>
-          </w:p>
-        </w:tc>
-      </w:tr>
-      <w:tr>
-        <w:trPr>
-          <w:cantSplit/>
-        </w:trPr>
-        <w:tc>
-          <w:tcPr/>
-          <w:p>
-            <w:pPr>
-              <w:pStyle w:val="Compact"/>
-              <w:jc w:val="both"/>
-            </w:pPr>
-            <w:r>
-              <w:rPr>
-                <w:rFonts w:ascii="Calibri" w:hAnsi="Calibri"/>
-                <w:sz w:val="18"/>
-              </w:rPr>
-              <w:t xml:space="preserve">Menor adoção</w:t>
-            </w:r>
-          </w:p>
-        </w:tc>
-        <w:tc>
-          <w:tcPr/>
-          <w:p>
-            <w:pPr>
-              <w:pStyle w:val="Compact"/>
-              <w:jc w:val="both"/>
-            </w:pPr>
-            <w:r>
-              <w:rPr>
-                <w:rFonts w:ascii="Calibri" w:hAnsi="Calibri"/>
-                <w:sz w:val="18"/>
-              </w:rPr>
-              <w:t xml:space="preserve">2201. A organização elabora um catálogo de serviços de tecnologia da informação e monitora níveis de serviço.</w:t>
-            </w:r>
-          </w:p>
-        </w:tc>
-        <w:tc>
-          <w:tcPr/>
-          <w:p>
-            <w:pPr>
-              <w:pStyle w:val="Compact"/>
-              <w:jc w:val="both"/>
-            </w:pPr>
-            <w:r>
-              <w:rPr>
-                <w:rFonts w:ascii="Calibri" w:hAnsi="Calibri"/>
-                <w:sz w:val="18"/>
-              </w:rPr>
-              <w:t xml:space="preserve">0,103</w:t>
-            </w:r>
-          </w:p>
-        </w:tc>
-        <w:tc>
-          <w:tcPr/>
-          <w:p>
-            <w:pPr>
-              <w:pStyle w:val="Compact"/>
-              <w:jc w:val="both"/>
-            </w:pPr>
-            <w:r>
-              <w:rPr>
-                <w:rFonts w:ascii="Calibri" w:hAnsi="Calibri"/>
-                <w:sz w:val="18"/>
-              </w:rPr>
-              <w:t xml:space="preserve">2</w:t>
-            </w:r>
-          </w:p>
-        </w:tc>
-      </w:tr>
-      <w:tr>
-        <w:trPr>
-          <w:cantSplit/>
-        </w:trPr>
-        <w:tc>
-          <w:tcPr/>
-          <w:p>
-            <w:pPr>
-              <w:pStyle w:val="Compact"/>
-              <w:jc w:val="both"/>
-            </w:pPr>
-            <w:r>
-              <w:rPr>
-                <w:rFonts w:ascii="Calibri" w:hAnsi="Calibri"/>
-                <w:sz w:val="18"/>
-              </w:rPr>
-              <w:t xml:space="preserve">Menor adoção</w:t>
-            </w:r>
-          </w:p>
-        </w:tc>
-        <w:tc>
-          <w:tcPr/>
-          <w:p>
-            <w:pPr>
-              <w:pStyle w:val="Compact"/>
-              <w:jc w:val="both"/>
-            </w:pPr>
-            <w:r>
-              <w:rPr>
-                <w:rFonts w:ascii="Calibri" w:hAnsi="Calibri"/>
-                <w:sz w:val="18"/>
-              </w:rPr>
-              <w:t xml:space="preserve">1003. A instância superior de governança recebe serviços de auditoria interna que adicionam valor à organização.</w:t>
-            </w:r>
-          </w:p>
-        </w:tc>
-        <w:tc>
-          <w:tcPr/>
-          <w:p>
-            <w:pPr>
-              <w:pStyle w:val="Compact"/>
-              <w:jc w:val="both"/>
-            </w:pPr>
-            <w:r>
-              <w:rPr>
-                <w:rFonts w:ascii="Calibri" w:hAnsi="Calibri"/>
-                <w:sz w:val="18"/>
-              </w:rPr>
-              <w:t xml:space="preserve">0,119</w:t>
-            </w:r>
-          </w:p>
-        </w:tc>
-        <w:tc>
-          <w:tcPr/>
-          <w:p>
-            <w:pPr>
-              <w:pStyle w:val="Compact"/>
-              <w:jc w:val="both"/>
-            </w:pPr>
-            <w:r>
-              <w:rPr>
-                <w:rFonts w:ascii="Calibri" w:hAnsi="Calibri"/>
-                <w:sz w:val="18"/>
-              </w:rPr>
-              <w:t xml:space="preserve">1</w:t>
-            </w:r>
-          </w:p>
-        </w:tc>
-      </w:tr>
-      <w:tr>
-        <w:trPr>
-          <w:cantSplit/>
-        </w:trPr>
-        <w:tc>
-          <w:tcPr/>
-          <w:p>
-            <w:pPr>
-              <w:pStyle w:val="Compact"/>
-              <w:jc w:val="both"/>
-            </w:pPr>
-            <w:r>
-              <w:rPr>
-                <w:rFonts w:ascii="Calibri" w:hAnsi="Calibri"/>
-                <w:sz w:val="18"/>
-              </w:rPr>
-              <w:t xml:space="preserve">Menor adoção</w:t>
-            </w:r>
-          </w:p>
-        </w:tc>
-        <w:tc>
-          <w:tcPr/>
-          <w:p>
-            <w:pPr>
-              <w:pStyle w:val="Compact"/>
-              <w:jc w:val="both"/>
-            </w:pPr>
-            <w:r>
-              <w:rPr>
-                <w:rFonts w:ascii="Calibri" w:hAnsi="Calibri"/>
-                <w:sz w:val="18"/>
-              </w:rPr>
-              <w:t xml:space="preserve">2503. A organização executa processo para classificação e tratamento de informações.</w:t>
-            </w:r>
-          </w:p>
-        </w:tc>
-        <w:tc>
-          <w:tcPr/>
-          <w:p>
-            <w:pPr>
-              <w:pStyle w:val="Compact"/>
-              <w:jc w:val="both"/>
-            </w:pPr>
-            <w:r>
-              <w:rPr>
-                <w:rFonts w:ascii="Calibri" w:hAnsi="Calibri"/>
-                <w:sz w:val="18"/>
-              </w:rPr>
-              <w:t xml:space="preserve">0,124</w:t>
-            </w:r>
-          </w:p>
-        </w:tc>
-        <w:tc>
-          <w:tcPr/>
-          <w:p>
-            <w:pPr>
-              <w:pStyle w:val="Compact"/>
-              <w:jc w:val="both"/>
-            </w:pPr>
-            <w:r>
-              <w:rPr>
-                <w:rFonts w:ascii="Calibri" w:hAnsi="Calibri"/>
-                <w:sz w:val="18"/>
-              </w:rPr>
-              <w:t xml:space="preserve">1</w:t>
-            </w:r>
-          </w:p>
-        </w:tc>
-      </w:tr>
-      <w:tr>
-        <w:trPr>
-          <w:cantSplit/>
-        </w:trPr>
-        <w:tc>
-          <w:tcPr/>
-          <w:p>
-            <w:pPr>
-              <w:pStyle w:val="Compact"/>
-              <w:jc w:val="both"/>
-            </w:pPr>
-            <w:r>
-              <w:rPr>
-                <w:rFonts w:ascii="Calibri" w:hAnsi="Calibri"/>
-                <w:sz w:val="18"/>
-              </w:rPr>
-              <w:t xml:space="preserve">Menor adoção</w:t>
-            </w:r>
-          </w:p>
-        </w:tc>
-        <w:tc>
-          <w:tcPr/>
-          <w:p>
-            <w:pPr>
-              <w:pStyle w:val="Compact"/>
-              <w:jc w:val="both"/>
-            </w:pPr>
-            <w:r>
-              <w:rPr>
-                <w:rFonts w:ascii="Calibri" w:hAnsi="Calibri"/>
-                <w:sz w:val="18"/>
-              </w:rPr>
-              <w:t xml:space="preserve">1002. A alta administração monitora o desempenho da gestão de tecnologia da informação.</w:t>
-            </w:r>
-          </w:p>
-        </w:tc>
-        <w:tc>
-          <w:tcPr/>
-          <w:p>
-            <w:pPr>
-              <w:pStyle w:val="Compact"/>
-              <w:jc w:val="both"/>
-            </w:pPr>
-            <w:r>
-              <w:rPr>
-                <w:rFonts w:ascii="Calibri" w:hAnsi="Calibri"/>
-                <w:sz w:val="18"/>
-              </w:rPr>
-              <w:t xml:space="preserve">0,127</w:t>
-            </w:r>
-          </w:p>
-        </w:tc>
-        <w:tc>
-          <w:tcPr/>
-          <w:p>
-            <w:pPr>
-              <w:pStyle w:val="Compact"/>
-              <w:jc w:val="both"/>
-            </w:pPr>
-            <w:r>
-              <w:rPr>
-                <w:rFonts w:ascii="Calibri" w:hAnsi="Calibri"/>
-                <w:sz w:val="18"/>
-              </w:rPr>
-              <w:t xml:space="preserve">1</w:t>
-            </w:r>
-          </w:p>
-        </w:tc>
-      </w:tr>
-      <w:tr>
-        <w:trPr>
-          <w:cantSplit/>
-        </w:trPr>
-        <w:tc>
-          <w:tcPr/>
-          <w:p>
-            <w:pPr>
-              <w:pStyle w:val="Compact"/>
-              <w:keepNext/>
-              <w:jc w:val="both"/>
-            </w:pPr>
-            <w:r>
-              <w:rPr>
-                <w:rFonts w:ascii="Calibri" w:hAnsi="Calibri"/>
-                <w:sz w:val="18"/>
-              </w:rPr>
-              <w:t xml:space="preserve">Menor adoção</w:t>
-            </w:r>
-          </w:p>
-        </w:tc>
-        <w:tc>
-          <w:tcPr/>
-          <w:p>
-            <w:pPr>
-              <w:pStyle w:val="Compact"/>
-              <w:keepNext/>
-              <w:jc w:val="both"/>
-            </w:pPr>
-            <w:r>
-              <w:rPr>
-                <w:rFonts w:ascii="Calibri" w:hAnsi="Calibri"/>
-                <w:sz w:val="18"/>
-              </w:rPr>
-              <w:t xml:space="preserve">2203. A organização executa processo de gestão de configuração e ativos (de serviços de tecnologia da informação).</w:t>
-            </w:r>
-          </w:p>
-        </w:tc>
-        <w:tc>
-          <w:tcPr/>
-          <w:p>
-            <w:pPr>
-              <w:pStyle w:val="Compact"/>
-              <w:keepNext/>
-              <w:jc w:val="both"/>
-            </w:pPr>
-            <w:r>
-              <w:rPr>
-                <w:rFonts w:ascii="Calibri" w:hAnsi="Calibri"/>
-                <w:sz w:val="18"/>
-              </w:rPr>
-              <w:t xml:space="preserve">0,142</w:t>
-            </w:r>
-          </w:p>
-        </w:tc>
-        <w:tc>
-          <w:tcPr/>
-          <w:p>
-            <w:pPr>
-              <w:pStyle w:val="Compact"/>
-              <w:keepNext/>
-              <w:jc w:val="both"/>
-            </w:pPr>
-            <w:r>
-              <w:rPr>
-                <w:rFonts w:ascii="Calibri" w:hAnsi="Calibri"/>
-                <w:sz w:val="18"/>
-              </w:rPr>
-              <w:t xml:space="preserve">3</w:t>
             </w:r>
           </w:p>
         </w:tc>
@@ -9347,31 +8455,31 @@
         <w:pStyle w:val="FirstParagraph"/>
       </w:pPr>
       <w:r>
-        <w:t xml:space="preserve">Das 119 organizações abrangidas pela fiscalização, seis não apresentaram resposta válida ao questionário eletrônico encaminhado na segunda etapa de solicitação de informações. Por essa razão, não integraram o cálculo do iGovTI 2026 nem a apuração dos achados consolidados.</w:t>
-      </w:r>
-    </w:p>
-    <w:p>
-      <w:pPr>
-        <w:pStyle w:val="Corpodetexto"/>
-      </w:pPr>
-      <w:r>
-        <w:t xml:space="preserve">A comunicação inicial ocorreu mediante envio do ofício de apresentação e do TSID 1, oportunidade em que as organizações indicaram tempestivamente seus pontos focais para interlocução com a Equipe de Auditoria. Posteriormente, o TSID 2, contendo o link individualizado para preenchimento do questionário, foi encaminhado aos pontos focais indicados. Apesar das reiterações realizadas pela Equipe, não foi apresentada resposta válida ao instrumento.</w:t>
-      </w:r>
-    </w:p>
-    <w:p>
-      <w:pPr>
-        <w:pStyle w:val="Corpodetexto"/>
-      </w:pPr>
-      <w:r>
-        <w:t xml:space="preserve">Na fase de comentários do gestor, foi encaminhado o TSID 3 também às organizações sem resposta válida, para que pudessem confirmar a não participação, prestar esclarecimentos ou apresentar justificativas. Duas organizações confirmaram que não participaram da coleta, enquanto as outras não apresentaram manifestação.</w:t>
-      </w:r>
-    </w:p>
-    <w:p>
-      <w:pPr>
-        <w:pStyle w:val="Corpodetexto"/>
-      </w:pPr>
-      <w:r>
-        <w:t xml:space="preserve">Os registros de envio, ciência e recebimento das comunicações, com indicação de data e hora, encontram-se reunidos no Anexo AN10 – Comunicações da fiscalização e registros de ciência. Esses elementos justificam a abertura de processos apartados para apuração das circunstâncias da ausência de resposta ao questionário, assegurando-se aos responsáveis a oportunidade de apresentar razões de defesa. A proposta constante do capítulo 7 não pressupõe reconhecimento antecipado de responsabilidade nem aplicação automática de sanção.</w:t>
+        <w:t xml:space="preserve">Das 119 organizações abrangidas pela fiscalização, seis não apresentaram resposta válida ao questionário eletrônico encaminhado na segunda etapa de solicitação de informações. A exportação integral da coleta registra que a EMOP iniciou o preenchimento, alcançou parte dos blocos do questionário e anexou cinco arquivos, mas o registro permaneceu incompleto e sem data de submissão final. Como respostas em elaboração não constituem declaração definitiva do auditado, nenhum dos seis casos integrou o cálculo do iGovTI 2026 ou a apuração dos achados consolidados.</w:t>
+      </w:r>
+    </w:p>
+    <w:p>
+      <w:pPr>
+        <w:pStyle w:val="Corpodetexto"/>
+      </w:pPr>
+      <w:r>
+        <w:t xml:space="preserve">A comunicação inicial ocorreu mediante envio do ofício de apresentação e do TSID 1, oportunidade em que as organizações indicaram seus pontos focais para interlocução com a Equipe de Auditoria. Posteriormente, o TSID 2, contendo o link individualizado para preenchimento do questionário, foi encaminhado aos pontos focais indicados. Apesar das reiterações realizadas pela Equipe, não foi apresentada resposta válida ao instrumento. Em 23/6/2026, o ponto focal da EMOP solicitou a reabertura do questionário e informou ter estado ausente por problemas de saúde, circunstância que deve ser considerada na apuração individualizada.</w:t>
+      </w:r>
+    </w:p>
+    <w:p>
+      <w:pPr>
+        <w:pStyle w:val="Corpodetexto"/>
+      </w:pPr>
+      <w:r>
+        <w:t xml:space="preserve">Na fase de comentários do gestor, foi encaminhado o TSID 3 também às organizações sem resposta válida, para que pudessem confirmar a não participação, prestar esclarecimentos ou apresentar justificativas. EMOP e PESAGRO concluíram o questionário eletrônico dessa etapa e confirmaram a ausência de resposta válida. A SESP manifestou-se por e-mail e pelo Ofício SESP-GABSEC nº 1.067, recebido em 21/7/2026. No conjunto dessa documentação, informou que a servidora anteriormente indicada como ponto focal havia se desvinculado da Secretaria, que a demanda somente fora encaminhada internamente em 17/7/2026 e que, quando a pendência foi identificada, o link estava expirado; indicou novo ponto focal e solicitou novo prazo e acesso. A Equipe informou à SESP, em 24/7/2026, que os prazos haviam se encerrado, mas que a manifestação seria considerada no relatório final. CEHAB, SEDCON e SEPOL não apresentaram esclarecimentos nessa etapa.</w:t>
+      </w:r>
+    </w:p>
+    <w:p>
+      <w:pPr>
+        <w:pStyle w:val="Corpodetexto"/>
+      </w:pPr>
+      <w:r>
+        <w:t xml:space="preserve">Os registros de envio, ciência e recebimento das comunicações, com indicação de data e hora, encontram-se reunidos no Anexo AN10 – Comunicações da fiscalização e registros de ciência. Em conjunto com a exportação integral da coleta, esses elementos justificam a abertura de processos apartados para apuração individualizada das circunstâncias da ausência de resposta válida, assegurando-se aos responsáveis a oportunidade de apresentar razões de defesa. A documentação demonstra a ausência de submissão válida, mas não basta, isoladamente, para caracterizar obstrução ou sonegação de informações. A proposta constante do capítulo 7 não pressupõe reconhecimento antecipado de responsabilidade nem aplicação automática de sanção.</w:t>
       </w:r>
     </w:p>
     <w:p>
@@ -9428,7 +8536,20 @@
         <w:pStyle w:val="FirstParagraph"/>
       </w:pPr>
       <w:r>
-        <w:t xml:space="preserve">Foram recebidas manifestações válidas de 80 das 119 organizações abrangidas (67,2%). Esse total compreende 78 das 113 organizações que responderam ao iGovTI 2026 e receberam relatório individual (69,0%) e duas das seis organizações sem resposta válida ao questionário (33,3%).</w:t>
+        <w:t xml:space="preserve">Foram recebidas submissões válidas no questionário eletrônico de comentários de 80 das 119 organizações abrangidas (67,2%). Esse total compreende 78 das 113 organizações que responderam ao iGovTI 2026 e receberam relatório individual (69,0%) e duas das seis organizações sem resposta válida ao questionário (33,3%). A manifestação da SESP, encaminhada fora do</w:t>
+      </w:r>
+      <w:r>
+        <w:t xml:space="preserve"> </w:t>
+      </w:r>
+      <w:r>
+        <w:rPr>
+          <w:i/>
+          <w:iCs/>
+        </w:rPr>
+        <w:t xml:space="preserve">LimeSurvey</w:t>
+      </w:r>
+      <w:r>
+        <w:t xml:space="preserve">, não integra essas estatísticas, mas foi examinada qualitativamente na Seção 5.6.</w:t>
       </w:r>
     </w:p>
     <w:p>
@@ -13800,15 +12921,23 @@
         <w:pStyle w:val="FirstParagraph"/>
       </w:pPr>
       <w:r>
-        <w:t xml:space="preserve">Das seis organizações sem resposta válida ao questionário iGovTI 2026, EMOP e PESAGRO responderam à etapa de comentários e confirmaram a ausência de resposta válida, sem apresentar justificativa textual ou arquivo comprobatório. CEHAB, SEDCON, SEPOL e SESP não apresentaram manifestação.</w:t>
-      </w:r>
-    </w:p>
-    <w:p>
-      <w:pPr>
-        <w:pStyle w:val="Corpodetexto"/>
-      </w:pPr>
-      <w:r>
-        <w:t xml:space="preserve">As duas confirmações corroboram a inexistência de resposta válida nas bases processadas, mas não constituem, por si mesmas, análise de responsabilidade. Para as quatro organizações sem manifestação, permanece a ausência de esclarecimentos nesta etapa. Conforme exposto na Seção 4.5, eventual apuração deverá considerar os registros de comunicação, ciência, prazos e circunstâncias individualizadas, com garantia do contraditório.</w:t>
+        <w:t xml:space="preserve">Das seis organizações sem resposta válida ao questionário iGovTI 2026, EMOP e PESAGRO concluíram o questionário eletrônico de comentários e confirmaram essa condição, sem apresentar, nesse instrumento, justificativa textual ou arquivo comprobatório. A ausência de justificativa no questionário de comentários não esgota, contudo, os registros da EMOP: a exportação integral da coleta contém resposta parcial, com cinco anexos, e o ponto focal solicitou a reabertura do formulário em 23/6/2026, alegando afastamento por problemas de saúde.</w:t>
+      </w:r>
+    </w:p>
+    <w:p>
+      <w:pPr>
+        <w:pStyle w:val="Corpodetexto"/>
+      </w:pPr>
+      <w:r>
+        <w:t xml:space="preserve">A SESP não concluiu o questionário eletrônico de comentários, mas apresentou esclarecimentos por e-mail e pelo Ofício SESP-GABSEC nº 1.067. Informou que a servidora anteriormente indicada como ponto focal havia se desvinculado da Secretaria, que a comunicação somente fora encaminhada internamente em 17/7/2026 e que o link estava expirado quando a pendência foi identificada; indicou novo ponto focal e solicitou novo prazo e acesso. CEHAB, SEDCON e SEPOL não apresentaram esclarecimentos nessa etapa.</w:t>
+      </w:r>
+    </w:p>
+    <w:p>
+      <w:pPr>
+        <w:pStyle w:val="Corpodetexto"/>
+      </w:pPr>
+      <w:r>
+        <w:t xml:space="preserve">As manifestações recebidas e o preenchimento parcial da EMOP não equivalem a resposta válida ao questionário iGovTI nem autorizam incorporar dados incompletos ao cálculo do índice. São, porém, elementos relevantes para a análise de responsabilidade. Conforme exposto na Seção 4.5, eventual apuração deverá considerar os registros de comunicação, ciência, prazos, o grau de cooperação demonstrado e as circunstâncias individualizadas, com garantia do contraditório.</w:t>
       </w:r>
     </w:p>
     <w:bookmarkEnd w:id="159"/>
@@ -14495,10 +13624,10 @@
           <w:b/>
           <w:bCs/>
         </w:rPr>
-        <w:t xml:space="preserve">ABERTURA DE PROCESSO APARTADO PARA APURAÇÃO DE POSSÍVEL OBSTRUÇÃO À AUDITORIA</w:t>
-      </w:r>
-      <w:r>
-        <w:t xml:space="preserve">, para cada uma das organizações fiscalizadas que não apresentaram resposta válida ao questionário eletrônico, apesar das comunicações e reiterações registradas no Anexo AN10, a saber:</w:t>
+        <w:t xml:space="preserve">ABERTURA DE PROCESSOS APARTADOS PARA APURAÇÃO INDIVIDUALIZADA DAS CIRCUNSTÂNCIAS DA AUSÊNCIA DE RESPOSTA VÁLIDA E DE EVENTUAL OBSTRUÇÃO OU SONEGAÇÃO DE INFORMAÇÕES</w:t>
+      </w:r>
+      <w:r>
+        <w:t xml:space="preserve">, para cada uma das organizações fiscalizadas que não apresentaram submissão válida ao questionário eletrônico, a saber:</w:t>
       </w:r>
       <w:r>
         <w:t xml:space="preserve"> </w:t>
@@ -14592,7 +13721,7 @@
         <w:t xml:space="preserve">NOTIFICAÇÃO</w:t>
       </w:r>
       <w:r>
-        <w:t xml:space="preserve">, nos termos regimentais, para que os respectivos responsáveis apresentem razões de defesa acerca da ausência de resposta válida às solicitações da fiscalização, conduta passível de aplicação de multa, nos termos do art. 63, incisos V e VI, da Lei Complementar Estadual n.º 63/1990;</w:t>
+        <w:t xml:space="preserve">, nos termos regimentais, para que os respectivos responsáveis apresentem razões de defesa. Na instrução, deverão ser considerados os registros do Anexo AN10, a resposta parcial e o pedido de reabertura apresentados pela EMOP, os esclarecimentos e o Ofício SESP-GABSEC nº 1.067 encaminhados pela SESP e os demais elementos individualizados, avaliando-se, somente se comprovada a conduta correspondente, a incidência do art. 63, incisos V ou VI, da Lei Complementar Estadual n.º 63/1990;</w:t>
       </w:r>
     </w:p>
     <w:p>

</xml_diff>

<commit_message>
Finaliza ajustes do relatório consolidado
</commit_message>
<xml_diff>
--- a/03-Relatorios/01-Relatorio_Consolidado/Relatório_altaresolucao_novo.docx
+++ b/03-Relatorios/01-Relatorio_Consolidado/Relatório_altaresolucao_novo.docx
@@ -220,7 +220,7 @@
                 <w:rFonts w:ascii="Calibri" w:hAnsi="Calibri"/>
                 <w:sz w:val="18"/>
               </w:rPr>
-              <w:t xml:space="preserve">84 organizações estaduais (AGENERSA, AGERIO, AGETRANSP, ALERJ, CEASA, CECIERJ, CEDAE, CEHAB, CENTRAL, CEPERJ, CGE, CODERTE, CODIN, DEGASE, DER-RJ, DETRAN, DETRO, DPGE, DRM, EMATER, EMOP, FAETEC, FAPERJ, FIA, FIPERJ, FLXIII, FMIS, FSERJ, FSC, FTM, FUNARJ, GSI, IEEA, INEA, IOERJ, IPEM, IRM, ISP, ITERJ, IVB, JUCERJA, LOTERJ, MPRJ, PESAGRO, PGE, PROCON, PRODERJ, RIOPREVIDENCIA, RIOTRILHOS, RJPREV, SEAP, SEAPPA, SECC, SECEC, SECID, SECTI, SEDCON, SEDEC, SEDEICS, SEDSDH, SEEDUC, SEEL, SEENEMAR, SEFAZ, SEGOV, SEHAB, SEIJES, SEINFRA, SEPLAG, SEPM, SEPOL, SERGB, SES, SESP, SETD, SETRAB, SETRANS, SETUR, SUDERJ, TCE-RJ, TJRJ, TURISRIO, UENF e UERJ) e 35 prefeituras municipais (Angra dos Reis, Araruama, Armação dos Búzios, Arraial do Cabo, Barra do Piraí, Belford Roxo, Cabo Frio, Campos dos Goytacazes, Casimiro de Abreu, Duque de Caxias, Guapimirim, Itaguaí, Japeri, Macaé, Magé, Maricá, Mesquita, Niterói, Nova Friburgo, Nova Iguaçu, Paraty, Petrópolis, Porto Real, Quatis, Queimados, Quissamã, Rio das Ostras, São Gonçalo, São João da Barra, São João de Meriti, São Pedro da Aldeia, Saquarema, Seropédica, Teresópolis e Volta Redonda).</w:t>
+              <w:t xml:space="preserve">84 organizações estaduais (AGENERSA, AGERIO, AGETRANSP, ALERJ, CEASA, CECIERJ, CEDAE, CEHAB, CENTRAL, CEPERJ, CGE, CODERTE, CODIN, DEGASE, DERRJ, DETRAN, DETRO, DPGE, DRM, EMATER, EMOP, FAETEC, FAPERJ, FIA, FIPERJ, FLXIII, FMIS, FS, FSC, FTM, FUNARJ, GSI, IEEA, INEA, IOERJ, IPEM, IRM, ISP, ITERJ, IVB, JUCERJA, LOTERJ, MPERJ, PESAGRO, PGE, PROCON, PRODERJ, RIOPREVIDENCIA, RIOTRILHOS, RJPREV, SEAP, SEAPPA, SECC, SECEC, SECID, SECTI, SEDCON, SEDEC, SEDEICS, SEDSDH, SEEDUC, SEEL, SEENEMAR, SEFAZ, SEGOV, SEHAB, SEIJES, SEINFRA, SEPLAG, SEPM, SEPOL, SERGB, SES, SESP, SETD, SETRAB, SETRANS, SETUR, SUDERJ, TCE-RJ, TJRJ, TURISRIO, UENF e UERJ) e 35 prefeituras municipais (Angra dos Reis, Araruama, Armação dos Búzios, Arraial do Cabo, Barra do Piraí, Belford Roxo, Cabo Frio, Campos dos Goytacazes, Casimiro de Abreu, Duque de Caxias, Guapimirim, Itaguaí, Japeri, Macaé, Magé, Maricá, Mesquita, Niterói, Nova Friburgo, Nova Iguaçu, Paraty, Petrópolis, Porto Real, Quatis, Queimados, Quissamã, Rio das Ostras, São Gonçalo, São João da Barra, São João de Meriti, São Pedro da Aldeia, Saquarema, Seropédica, Teresópolis e Volta Redonda).</w:t>
             </w:r>
           </w:p>
         </w:tc>
@@ -1277,7 +1277,7 @@
         <w:pStyle w:val="Corpodetexto"/>
       </w:pPr>
       <w:r>
-        <w:t xml:space="preserve">A fiscalização abrangeu 119 organizações, sendo 35 prefeituras e 84 organizações estaduais de diferentes poderes e naturezas jurídicas. Destas, 113 concluíram e submeteram resposta válida ao questionário e integraram o cálculo do iGovTI e os achados consolidados. As outras seis não apresentaram resposta válida e foram tratadas separadamente. Entre elas, a EMOP iniciou o preenchimento e anexou documentos, mas não concluiu nem submeteu o questionário.</w:t>
+        <w:t xml:space="preserve">A fiscalização abrangeu 119 organizações, sendo 35 prefeituras e 84 organizações estaduais de diferentes poderes e naturezas jurídicas. Destas, 113 concluíram e submeteram resposta válida ao questionário e integraram o cálculo do iGovTI e os achados consolidados. As outras seis não apresentaram resposta válida e foram tratadas separadamente.</w:t>
       </w:r>
     </w:p>
     <w:p>
@@ -1924,7 +1924,7 @@
         <w:pStyle w:val="Corpodetexto"/>
       </w:pPr>
       <w:r>
-        <w:t xml:space="preserve">Na esfera estadual, a seleção compreendeu as organizações integrantes do Sistema Estadual de Tecnologia da Informação e Comunicação (SETIC), acrescidas das organizações pertencentes aos demais Poderes e dos órgãos autônomos, a exemplo do Tribunal de Justiça do Estado do Rio de Janeiro (TJRJ), da Defensoria Pública do Estado do Rio de Janeiro (DPGE), do Ministério Público do Estado do Rio de Janeiro (MPRJ), do Tribunal de Contas do Estado do Rio de Janeiro (TCE-RJ) e da Assembleia Legislativa do Estado do Rio de Janeiro (ALERJ). Na esfera municipal, foram selecionadas as prefeituras com maiores gastos em TIC, conforme levantamentos internos da Equipe de Auditoria.</w:t>
+        <w:t xml:space="preserve">Na esfera estadual, a seleção compreendeu as organizações integrantes do Sistema Estadual de Tecnologia da Informação e Comunicação (SETIC), acrescidas das organizações pertencentes aos demais Poderes e dos órgãos autônomos, a exemplo do Tribunal de Justiça do Estado do Rio de Janeiro (TJRJ), da Defensoria Pública do Estado do Rio de Janeiro (DPGE), do Ministério Público do Estado do Rio de Janeiro (MPERJ), do Tribunal de Contas do Estado do Rio de Janeiro (TCE-RJ) e da Assembleia Legislativa do Estado do Rio de Janeiro (ALERJ). Na esfera municipal, foram selecionadas as prefeituras com maiores gastos em TIC, conforme levantamentos internos da Equipe de Auditoria.</w:t>
       </w:r>
     </w:p>
     <w:bookmarkEnd w:id="25"/>
@@ -2815,7 +2815,7 @@
         <w:pStyle w:val="Corpodetexto"/>
       </w:pPr>
       <w:r>
-        <w:t xml:space="preserve">A análise do Índice de Governança e Gestão de TI (iGovTI 2026) demonstra concentração de organizações com avaliações baixas. Esse resultado indica que, para a maioria das organizações avaliadas, os mecanismos de direção e os processos operacionais de tecnologia ainda não apresentam grau de formalização e efetividade compatível com o nível mínimo esperado de maturidade institucional.</w:t>
+        <w:t xml:space="preserve">A análise do Índice de Governança e Gestão de TI (iGovTI 2026) demonstra concentração de organizações com avaliações baixas. Esse resultado indica que, para a maioria das organizações avaliadas, os mecanismos de direção e os processos operacionais de tecnologia ainda não apresentam adoção e formalização documentalmente demonstradas em nível compatível com o mínimo esperado de maturidade institucional.</w:t>
       </w:r>
     </w:p>
     <w:p>
@@ -5488,15 +5488,217 @@
           <w:p>
             <w:pPr>
               <w:pStyle w:val="Compact"/>
+              <w:jc w:val="both"/>
+            </w:pPr>
+            <w:r>
+              <w:rPr>
+                <w:rFonts w:ascii="Calibri" w:hAnsi="Calibri"/>
+                <w:sz w:val="20"/>
+              </w:rPr>
+              <w:t xml:space="preserve">Segmento</w:t>
+            </w:r>
+          </w:p>
+        </w:tc>
+        <w:tc>
+          <w:tcPr/>
+          <w:p>
+            <w:pPr>
+              <w:pStyle w:val="Compact"/>
+              <w:jc w:val="both"/>
+            </w:pPr>
+            <w:r>
+              <w:rPr>
+                <w:rFonts w:ascii="Calibri" w:hAnsi="Calibri"/>
+                <w:sz w:val="20"/>
+              </w:rPr>
+              <w:t xml:space="preserve">Organizações</w:t>
+            </w:r>
+          </w:p>
+        </w:tc>
+        <w:tc>
+          <w:tcPr/>
+          <w:p>
+            <w:pPr>
+              <w:pStyle w:val="Compact"/>
+              <w:jc w:val="both"/>
+            </w:pPr>
+            <w:r>
+              <w:rPr>
+                <w:rFonts w:ascii="Calibri" w:hAnsi="Calibri"/>
+                <w:sz w:val="20"/>
+              </w:rPr>
+              <w:t xml:space="preserve">Média do iGovTI</w:t>
+            </w:r>
+          </w:p>
+        </w:tc>
+        <w:tc>
+          <w:tcPr/>
+          <w:p>
+            <w:pPr>
+              <w:pStyle w:val="Compact"/>
+              <w:jc w:val="both"/>
+            </w:pPr>
+            <w:r>
+              <w:rPr>
+                <w:rFonts w:ascii="Calibri" w:hAnsi="Calibri"/>
+                <w:sz w:val="20"/>
+              </w:rPr>
+              <w:t xml:space="preserve">Mediana do iGovTI</w:t>
+            </w:r>
+          </w:p>
+        </w:tc>
+        <w:tc>
+          <w:tcPr/>
+          <w:p>
+            <w:pPr>
+              <w:pStyle w:val="Compact"/>
+              <w:jc w:val="both"/>
+            </w:pPr>
+            <w:r>
+              <w:rPr>
+                <w:rFonts w:ascii="Calibri" w:hAnsi="Calibri"/>
+                <w:sz w:val="20"/>
+              </w:rPr>
+              <w:t xml:space="preserve">Média de Governança</w:t>
+            </w:r>
+          </w:p>
+        </w:tc>
+        <w:tc>
+          <w:tcPr/>
+          <w:p>
+            <w:pPr>
+              <w:pStyle w:val="Compact"/>
+              <w:jc w:val="both"/>
+            </w:pPr>
+            <w:r>
+              <w:rPr>
+                <w:rFonts w:ascii="Calibri" w:hAnsi="Calibri"/>
+                <w:sz w:val="20"/>
+              </w:rPr>
+              <w:t xml:space="preserve">Média de Gestão</w:t>
+            </w:r>
+          </w:p>
+        </w:tc>
+      </w:tr>
+      <w:tr>
+        <w:trPr>
+          <w:cantSplit/>
+        </w:trPr>
+        <w:tc>
+          <w:tcPr/>
+          <w:p>
+            <w:pPr>
+              <w:pStyle w:val="Compact"/>
+              <w:jc w:val="both"/>
+            </w:pPr>
+            <w:r>
+              <w:rPr>
+                <w:rFonts w:ascii="Calibri" w:hAnsi="Calibri"/>
+                <w:sz w:val="18"/>
+              </w:rPr>
+              <w:t xml:space="preserve">Organizações estaduais</w:t>
+            </w:r>
+          </w:p>
+        </w:tc>
+        <w:tc>
+          <w:tcPr/>
+          <w:p>
+            <w:pPr>
+              <w:pStyle w:val="Compact"/>
+              <w:jc w:val="both"/>
+            </w:pPr>
+            <w:r>
+              <w:rPr>
+                <w:rFonts w:ascii="Calibri" w:hAnsi="Calibri"/>
+                <w:sz w:val="18"/>
+              </w:rPr>
+              <w:t xml:space="preserve">78</w:t>
+            </w:r>
+          </w:p>
+        </w:tc>
+        <w:tc>
+          <w:tcPr/>
+          <w:p>
+            <w:pPr>
+              <w:pStyle w:val="Compact"/>
+              <w:jc w:val="both"/>
+            </w:pPr>
+            <w:r>
+              <w:rPr>
+                <w:rFonts w:ascii="Calibri" w:hAnsi="Calibri"/>
+                <w:sz w:val="18"/>
+              </w:rPr>
+              <w:t xml:space="preserve">0,220</w:t>
+            </w:r>
+          </w:p>
+        </w:tc>
+        <w:tc>
+          <w:tcPr/>
+          <w:p>
+            <w:pPr>
+              <w:pStyle w:val="Compact"/>
+              <w:jc w:val="both"/>
+            </w:pPr>
+            <w:r>
+              <w:rPr>
+                <w:rFonts w:ascii="Calibri" w:hAnsi="Calibri"/>
+                <w:sz w:val="18"/>
+              </w:rPr>
+              <w:t xml:space="preserve">0,152</w:t>
+            </w:r>
+          </w:p>
+        </w:tc>
+        <w:tc>
+          <w:tcPr/>
+          <w:p>
+            <w:pPr>
+              <w:pStyle w:val="Compact"/>
+              <w:jc w:val="both"/>
+            </w:pPr>
+            <w:r>
+              <w:rPr>
+                <w:rFonts w:ascii="Calibri" w:hAnsi="Calibri"/>
+                <w:sz w:val="18"/>
+              </w:rPr>
+              <w:t xml:space="preserve">0,187</w:t>
+            </w:r>
+          </w:p>
+        </w:tc>
+        <w:tc>
+          <w:tcPr/>
+          <w:p>
+            <w:pPr>
+              <w:pStyle w:val="Compact"/>
+              <w:jc w:val="both"/>
+            </w:pPr>
+            <w:r>
+              <w:rPr>
+                <w:rFonts w:ascii="Calibri" w:hAnsi="Calibri"/>
+                <w:sz w:val="18"/>
+              </w:rPr>
+              <w:t xml:space="preserve">0,251</w:t>
+            </w:r>
+          </w:p>
+        </w:tc>
+      </w:tr>
+      <w:tr>
+        <w:trPr>
+          <w:cantSplit/>
+        </w:trPr>
+        <w:tc>
+          <w:tcPr/>
+          <w:p>
+            <w:pPr>
+              <w:pStyle w:val="Compact"/>
               <w:keepNext/>
               <w:jc w:val="both"/>
             </w:pPr>
             <w:r>
               <w:rPr>
                 <w:rFonts w:ascii="Calibri" w:hAnsi="Calibri"/>
-                <w:sz w:val="20"/>
-              </w:rPr>
-              <w:t xml:space="preserve">Segmento</w:t>
+                <w:sz w:val="18"/>
+              </w:rPr>
+              <w:t xml:space="preserve">Municípios</w:t>
             </w:r>
           </w:p>
         </w:tc>
@@ -5511,9 +5713,9 @@
             <w:r>
               <w:rPr>
                 <w:rFonts w:ascii="Calibri" w:hAnsi="Calibri"/>
-                <w:sz w:val="20"/>
-              </w:rPr>
-              <w:t xml:space="preserve">Organizações</w:t>
+                <w:sz w:val="18"/>
+              </w:rPr>
+              <w:t xml:space="preserve">35</w:t>
             </w:r>
           </w:p>
         </w:tc>
@@ -5528,9 +5730,9 @@
             <w:r>
               <w:rPr>
                 <w:rFonts w:ascii="Calibri" w:hAnsi="Calibri"/>
-                <w:sz w:val="20"/>
-              </w:rPr>
-              <w:t xml:space="preserve">Média do iGovTI</w:t>
+                <w:sz w:val="18"/>
+              </w:rPr>
+              <w:t xml:space="preserve">0,120</w:t>
             </w:r>
           </w:p>
         </w:tc>
@@ -5545,9 +5747,9 @@
             <w:r>
               <w:rPr>
                 <w:rFonts w:ascii="Calibri" w:hAnsi="Calibri"/>
-                <w:sz w:val="20"/>
-              </w:rPr>
-              <w:t xml:space="preserve">Mediana do iGovTI</w:t>
+                <w:sz w:val="18"/>
+              </w:rPr>
+              <w:t xml:space="preserve">0,077</w:t>
             </w:r>
           </w:p>
         </w:tc>
@@ -5562,9 +5764,9 @@
             <w:r>
               <w:rPr>
                 <w:rFonts w:ascii="Calibri" w:hAnsi="Calibri"/>
-                <w:sz w:val="20"/>
-              </w:rPr>
-              <w:t xml:space="preserve">Média de Governança</w:t>
+                <w:sz w:val="18"/>
+              </w:rPr>
+              <w:t xml:space="preserve">0,120</w:t>
             </w:r>
           </w:p>
         </w:tc>
@@ -5579,9 +5781,9 @@
             <w:r>
               <w:rPr>
                 <w:rFonts w:ascii="Calibri" w:hAnsi="Calibri"/>
-                <w:sz w:val="20"/>
-              </w:rPr>
-              <w:t xml:space="preserve">Média de Gestão</w:t>
+                <w:sz w:val="18"/>
+              </w:rPr>
+              <w:t xml:space="preserve">0,119</w:t>
             </w:r>
           </w:p>
         </w:tc>
@@ -5649,7 +5851,7 @@
     <w:tbl>
       <w:tblPr>
         <w:tblStyle w:val="Table"/>
-        <w:tblW w:type="auto" w:w="0"/>
+        <w:tblW w:type="pct" w:w="5000"/>
         <w:jc w:val="center"/>
         <w:tblLayout w:type="autofit"/>
         <w:tblLook w:firstRow="1" w:lastRow="0" w:firstColumn="0" w:lastColumn="0" w:noHBand="0" w:noVBand="0" w:val="0020"/>
@@ -5671,15 +5873,705 @@
           <w:p>
             <w:pPr>
               <w:pStyle w:val="Compact"/>
+              <w:jc w:val="both"/>
+            </w:pPr>
+            <w:r>
+              <w:rPr>
+                <w:rFonts w:ascii="Calibri" w:hAnsi="Calibri"/>
+                <w:sz w:val="20"/>
+              </w:rPr>
+              <w:t xml:space="preserve">Grupo</w:t>
+            </w:r>
+          </w:p>
+        </w:tc>
+        <w:tc>
+          <w:tcPr/>
+          <w:p>
+            <w:pPr>
+              <w:pStyle w:val="Compact"/>
+              <w:jc w:val="both"/>
+            </w:pPr>
+            <w:r>
+              <w:rPr>
+                <w:rFonts w:ascii="Calibri" w:hAnsi="Calibri"/>
+                <w:sz w:val="20"/>
+              </w:rPr>
+              <w:t xml:space="preserve">Prática</w:t>
+            </w:r>
+          </w:p>
+        </w:tc>
+        <w:tc>
+          <w:tcPr/>
+          <w:p>
+            <w:pPr>
+              <w:pStyle w:val="Compact"/>
+              <w:jc w:val="both"/>
+            </w:pPr>
+            <w:r>
+              <w:rPr>
+                <w:rFonts w:ascii="Calibri" w:hAnsi="Calibri"/>
+                <w:sz w:val="20"/>
+              </w:rPr>
+              <w:t xml:space="preserve">Média</w:t>
+            </w:r>
+          </w:p>
+        </w:tc>
+        <w:tc>
+          <w:tcPr/>
+          <w:p>
+            <w:pPr>
+              <w:pStyle w:val="Compact"/>
+              <w:jc w:val="both"/>
+            </w:pPr>
+            <w:r>
+              <w:rPr>
+                <w:rFonts w:ascii="Calibri" w:hAnsi="Calibri"/>
+                <w:sz w:val="20"/>
+              </w:rPr>
+              <w:t xml:space="preserve">Não se aplica</w:t>
+            </w:r>
+          </w:p>
+        </w:tc>
+      </w:tr>
+      <w:tr>
+        <w:trPr>
+          <w:cantSplit/>
+        </w:trPr>
+        <w:tc>
+          <w:tcPr/>
+          <w:p>
+            <w:pPr>
+              <w:pStyle w:val="Compact"/>
+              <w:jc w:val="both"/>
+            </w:pPr>
+            <w:r>
+              <w:rPr>
+                <w:rFonts w:ascii="Calibri" w:hAnsi="Calibri"/>
+                <w:sz w:val="18"/>
+              </w:rPr>
+              <w:t xml:space="preserve">Maior adoção</w:t>
+            </w:r>
+          </w:p>
+        </w:tc>
+        <w:tc>
+          <w:tcPr/>
+          <w:p>
+            <w:pPr>
+              <w:pStyle w:val="Compact"/>
+              <w:jc w:val="both"/>
+            </w:pPr>
+            <w:r>
+              <w:rPr>
+                <w:rFonts w:ascii="Calibri" w:hAnsi="Calibri"/>
+                <w:sz w:val="18"/>
+              </w:rPr>
+              <w:t xml:space="preserve">2401. A organização dispõe de uma política de segurança da informação.</w:t>
+            </w:r>
+          </w:p>
+        </w:tc>
+        <w:tc>
+          <w:tcPr/>
+          <w:p>
+            <w:pPr>
+              <w:pStyle w:val="Compact"/>
+              <w:jc w:val="both"/>
+            </w:pPr>
+            <w:r>
+              <w:rPr>
+                <w:rFonts w:ascii="Calibri" w:hAnsi="Calibri"/>
+                <w:sz w:val="18"/>
+              </w:rPr>
+              <w:t xml:space="preserve">0,338</w:t>
+            </w:r>
+          </w:p>
+        </w:tc>
+        <w:tc>
+          <w:tcPr/>
+          <w:p>
+            <w:pPr>
+              <w:pStyle w:val="Compact"/>
+              <w:jc w:val="both"/>
+            </w:pPr>
+            <w:r>
+              <w:rPr>
+                <w:rFonts w:ascii="Calibri" w:hAnsi="Calibri"/>
+                <w:sz w:val="18"/>
+              </w:rPr>
+              <w:t xml:space="preserve">4</w:t>
+            </w:r>
+          </w:p>
+        </w:tc>
+      </w:tr>
+      <w:tr>
+        <w:trPr>
+          <w:cantSplit/>
+        </w:trPr>
+        <w:tc>
+          <w:tcPr/>
+          <w:p>
+            <w:pPr>
+              <w:pStyle w:val="Compact"/>
+              <w:jc w:val="both"/>
+            </w:pPr>
+            <w:r>
+              <w:rPr>
+                <w:rFonts w:ascii="Calibri" w:hAnsi="Calibri"/>
+                <w:sz w:val="18"/>
+              </w:rPr>
+              <w:t xml:space="preserve">Maior adoção</w:t>
+            </w:r>
+          </w:p>
+        </w:tc>
+        <w:tc>
+          <w:tcPr/>
+          <w:p>
+            <w:pPr>
+              <w:pStyle w:val="Compact"/>
+              <w:jc w:val="both"/>
+            </w:pPr>
+            <w:r>
+              <w:rPr>
+                <w:rFonts w:ascii="Calibri" w:hAnsi="Calibri"/>
+                <w:sz w:val="18"/>
+              </w:rPr>
+              <w:t xml:space="preserve">2101. A organização executa processo de planejamento de tecnologia da informação.</w:t>
+            </w:r>
+          </w:p>
+        </w:tc>
+        <w:tc>
+          <w:tcPr/>
+          <w:p>
+            <w:pPr>
+              <w:pStyle w:val="Compact"/>
+              <w:jc w:val="both"/>
+            </w:pPr>
+            <w:r>
+              <w:rPr>
+                <w:rFonts w:ascii="Calibri" w:hAnsi="Calibri"/>
+                <w:sz w:val="18"/>
+              </w:rPr>
+              <w:t xml:space="preserve">0,314</w:t>
+            </w:r>
+          </w:p>
+        </w:tc>
+        <w:tc>
+          <w:tcPr/>
+          <w:p>
+            <w:pPr>
+              <w:pStyle w:val="Compact"/>
+              <w:jc w:val="both"/>
+            </w:pPr>
+            <w:r>
+              <w:rPr>
+                <w:rFonts w:ascii="Calibri" w:hAnsi="Calibri"/>
+                <w:sz w:val="18"/>
+              </w:rPr>
+              <w:t xml:space="preserve">1</w:t>
+            </w:r>
+          </w:p>
+        </w:tc>
+      </w:tr>
+      <w:tr>
+        <w:trPr>
+          <w:cantSplit/>
+        </w:trPr>
+        <w:tc>
+          <w:tcPr/>
+          <w:p>
+            <w:pPr>
+              <w:pStyle w:val="Compact"/>
+              <w:jc w:val="both"/>
+            </w:pPr>
+            <w:r>
+              <w:rPr>
+                <w:rFonts w:ascii="Calibri" w:hAnsi="Calibri"/>
+                <w:sz w:val="18"/>
+              </w:rPr>
+              <w:t xml:space="preserve">Maior adoção</w:t>
+            </w:r>
+          </w:p>
+        </w:tc>
+        <w:tc>
+          <w:tcPr/>
+          <w:p>
+            <w:pPr>
+              <w:pStyle w:val="Compact"/>
+              <w:jc w:val="both"/>
+            </w:pPr>
+            <w:r>
+              <w:rPr>
+                <w:rFonts w:ascii="Calibri" w:hAnsi="Calibri"/>
+                <w:sz w:val="18"/>
+              </w:rPr>
+              <w:t xml:space="preserve">2102. A organização possui plano de tecnologia da informação vigente.</w:t>
+            </w:r>
+          </w:p>
+        </w:tc>
+        <w:tc>
+          <w:tcPr/>
+          <w:p>
+            <w:pPr>
+              <w:pStyle w:val="Compact"/>
+              <w:jc w:val="both"/>
+            </w:pPr>
+            <w:r>
+              <w:rPr>
+                <w:rFonts w:ascii="Calibri" w:hAnsi="Calibri"/>
+                <w:sz w:val="18"/>
+              </w:rPr>
+              <w:t xml:space="preserve">0,296</w:t>
+            </w:r>
+          </w:p>
+        </w:tc>
+        <w:tc>
+          <w:tcPr/>
+          <w:p>
+            <w:pPr>
+              <w:pStyle w:val="Compact"/>
+              <w:jc w:val="both"/>
+            </w:pPr>
+            <w:r>
+              <w:rPr>
+                <w:rFonts w:ascii="Calibri" w:hAnsi="Calibri"/>
+                <w:sz w:val="18"/>
+              </w:rPr>
+              <w:t xml:space="preserve">2</w:t>
+            </w:r>
+          </w:p>
+        </w:tc>
+      </w:tr>
+      <w:tr>
+        <w:trPr>
+          <w:cantSplit/>
+        </w:trPr>
+        <w:tc>
+          <w:tcPr/>
+          <w:p>
+            <w:pPr>
+              <w:pStyle w:val="Compact"/>
+              <w:jc w:val="both"/>
+            </w:pPr>
+            <w:r>
+              <w:rPr>
+                <w:rFonts w:ascii="Calibri" w:hAnsi="Calibri"/>
+                <w:sz w:val="18"/>
+              </w:rPr>
+              <w:t xml:space="preserve">Maior adoção</w:t>
+            </w:r>
+          </w:p>
+        </w:tc>
+        <w:tc>
+          <w:tcPr/>
+          <w:p>
+            <w:pPr>
+              <w:pStyle w:val="Compact"/>
+              <w:jc w:val="both"/>
+            </w:pPr>
+            <w:r>
+              <w:rPr>
+                <w:rFonts w:ascii="Calibri" w:hAnsi="Calibri"/>
+                <w:sz w:val="18"/>
+              </w:rPr>
+              <w:t xml:space="preserve">2501/2502. Gestão de ativos associados à informação e controle de acesso, conforme composição prevista na metodologia.</w:t>
+            </w:r>
+          </w:p>
+        </w:tc>
+        <w:tc>
+          <w:tcPr/>
+          <w:p>
+            <w:pPr>
+              <w:pStyle w:val="Compact"/>
+              <w:jc w:val="both"/>
+            </w:pPr>
+            <w:r>
+              <w:rPr>
+                <w:rFonts w:ascii="Calibri" w:hAnsi="Calibri"/>
+                <w:sz w:val="18"/>
+              </w:rPr>
+              <w:t xml:space="preserve">0,241</w:t>
+            </w:r>
+          </w:p>
+        </w:tc>
+        <w:tc>
+          <w:tcPr/>
+          <w:p>
+            <w:pPr>
+              <w:pStyle w:val="Compact"/>
+              <w:jc w:val="both"/>
+            </w:pPr>
+            <w:r>
+              <w:rPr>
+                <w:rFonts w:ascii="Calibri" w:hAnsi="Calibri"/>
+                <w:sz w:val="18"/>
+              </w:rPr>
+              <w:t xml:space="preserve">1</w:t>
+            </w:r>
+          </w:p>
+        </w:tc>
+      </w:tr>
+      <w:tr>
+        <w:trPr>
+          <w:cantSplit/>
+        </w:trPr>
+        <w:tc>
+          <w:tcPr/>
+          <w:p>
+            <w:pPr>
+              <w:pStyle w:val="Compact"/>
+              <w:jc w:val="both"/>
+            </w:pPr>
+            <w:r>
+              <w:rPr>
+                <w:rFonts w:ascii="Calibri" w:hAnsi="Calibri"/>
+                <w:sz w:val="18"/>
+              </w:rPr>
+              <w:t xml:space="preserve">Maior adoção</w:t>
+            </w:r>
+          </w:p>
+        </w:tc>
+        <w:tc>
+          <w:tcPr/>
+          <w:p>
+            <w:pPr>
+              <w:pStyle w:val="Compact"/>
+              <w:jc w:val="both"/>
+            </w:pPr>
+            <w:r>
+              <w:rPr>
+                <w:rFonts w:ascii="Calibri" w:hAnsi="Calibri"/>
+                <w:sz w:val="18"/>
+              </w:rPr>
+              <w:t xml:space="preserve">2504. A organização executa atividades de gestão da segurança dos recursos de processamento da informação, inclusive dos recursos de computação em nuvem.</w:t>
+            </w:r>
+          </w:p>
+        </w:tc>
+        <w:tc>
+          <w:tcPr/>
+          <w:p>
+            <w:pPr>
+              <w:pStyle w:val="Compact"/>
+              <w:jc w:val="both"/>
+            </w:pPr>
+            <w:r>
+              <w:rPr>
+                <w:rFonts w:ascii="Calibri" w:hAnsi="Calibri"/>
+                <w:sz w:val="18"/>
+              </w:rPr>
+              <w:t xml:space="preserve">0,238</w:t>
+            </w:r>
+          </w:p>
+        </w:tc>
+        <w:tc>
+          <w:tcPr/>
+          <w:p>
+            <w:pPr>
+              <w:pStyle w:val="Compact"/>
+              <w:jc w:val="both"/>
+            </w:pPr>
+            <w:r>
+              <w:rPr>
+                <w:rFonts w:ascii="Calibri" w:hAnsi="Calibri"/>
+                <w:sz w:val="18"/>
+              </w:rPr>
+              <w:t xml:space="preserve">4</w:t>
+            </w:r>
+          </w:p>
+        </w:tc>
+      </w:tr>
+      <w:tr>
+        <w:trPr>
+          <w:cantSplit/>
+        </w:trPr>
+        <w:tc>
+          <w:tcPr/>
+          <w:p>
+            <w:pPr>
+              <w:pStyle w:val="Compact"/>
+              <w:jc w:val="both"/>
+            </w:pPr>
+            <w:r>
+              <w:rPr>
+                <w:rFonts w:ascii="Calibri" w:hAnsi="Calibri"/>
+                <w:sz w:val="18"/>
+              </w:rPr>
+              <w:t xml:space="preserve">Menor adoção</w:t>
+            </w:r>
+          </w:p>
+        </w:tc>
+        <w:tc>
+          <w:tcPr/>
+          <w:p>
+            <w:pPr>
+              <w:pStyle w:val="Compact"/>
+              <w:jc w:val="both"/>
+            </w:pPr>
+            <w:r>
+              <w:rPr>
+                <w:rFonts w:ascii="Calibri" w:hAnsi="Calibri"/>
+                <w:sz w:val="18"/>
+              </w:rPr>
+              <w:t xml:space="preserve">2201. A organização elabora um catálogo de serviços de tecnologia da informação e monitora níveis de serviço.</w:t>
+            </w:r>
+          </w:p>
+        </w:tc>
+        <w:tc>
+          <w:tcPr/>
+          <w:p>
+            <w:pPr>
+              <w:pStyle w:val="Compact"/>
+              <w:jc w:val="both"/>
+            </w:pPr>
+            <w:r>
+              <w:rPr>
+                <w:rFonts w:ascii="Calibri" w:hAnsi="Calibri"/>
+                <w:sz w:val="18"/>
+              </w:rPr>
+              <w:t xml:space="preserve">0,103</w:t>
+            </w:r>
+          </w:p>
+        </w:tc>
+        <w:tc>
+          <w:tcPr/>
+          <w:p>
+            <w:pPr>
+              <w:pStyle w:val="Compact"/>
+              <w:jc w:val="both"/>
+            </w:pPr>
+            <w:r>
+              <w:rPr>
+                <w:rFonts w:ascii="Calibri" w:hAnsi="Calibri"/>
+                <w:sz w:val="18"/>
+              </w:rPr>
+              <w:t xml:space="preserve">2</w:t>
+            </w:r>
+          </w:p>
+        </w:tc>
+      </w:tr>
+      <w:tr>
+        <w:trPr>
+          <w:cantSplit/>
+        </w:trPr>
+        <w:tc>
+          <w:tcPr/>
+          <w:p>
+            <w:pPr>
+              <w:pStyle w:val="Compact"/>
+              <w:jc w:val="both"/>
+            </w:pPr>
+            <w:r>
+              <w:rPr>
+                <w:rFonts w:ascii="Calibri" w:hAnsi="Calibri"/>
+                <w:sz w:val="18"/>
+              </w:rPr>
+              <w:t xml:space="preserve">Menor adoção</w:t>
+            </w:r>
+          </w:p>
+        </w:tc>
+        <w:tc>
+          <w:tcPr/>
+          <w:p>
+            <w:pPr>
+              <w:pStyle w:val="Compact"/>
+              <w:jc w:val="both"/>
+            </w:pPr>
+            <w:r>
+              <w:rPr>
+                <w:rFonts w:ascii="Calibri" w:hAnsi="Calibri"/>
+                <w:sz w:val="18"/>
+              </w:rPr>
+              <w:t xml:space="preserve">1003. A instância superior de governança recebe serviços de auditoria interna que adicionam valor à organização.</w:t>
+            </w:r>
+          </w:p>
+        </w:tc>
+        <w:tc>
+          <w:tcPr/>
+          <w:p>
+            <w:pPr>
+              <w:pStyle w:val="Compact"/>
+              <w:jc w:val="both"/>
+            </w:pPr>
+            <w:r>
+              <w:rPr>
+                <w:rFonts w:ascii="Calibri" w:hAnsi="Calibri"/>
+                <w:sz w:val="18"/>
+              </w:rPr>
+              <w:t xml:space="preserve">0,119</w:t>
+            </w:r>
+          </w:p>
+        </w:tc>
+        <w:tc>
+          <w:tcPr/>
+          <w:p>
+            <w:pPr>
+              <w:pStyle w:val="Compact"/>
+              <w:jc w:val="both"/>
+            </w:pPr>
+            <w:r>
+              <w:rPr>
+                <w:rFonts w:ascii="Calibri" w:hAnsi="Calibri"/>
+                <w:sz w:val="18"/>
+              </w:rPr>
+              <w:t xml:space="preserve">1</w:t>
+            </w:r>
+          </w:p>
+        </w:tc>
+      </w:tr>
+      <w:tr>
+        <w:trPr>
+          <w:cantSplit/>
+        </w:trPr>
+        <w:tc>
+          <w:tcPr/>
+          <w:p>
+            <w:pPr>
+              <w:pStyle w:val="Compact"/>
+              <w:jc w:val="both"/>
+            </w:pPr>
+            <w:r>
+              <w:rPr>
+                <w:rFonts w:ascii="Calibri" w:hAnsi="Calibri"/>
+                <w:sz w:val="18"/>
+              </w:rPr>
+              <w:t xml:space="preserve">Menor adoção</w:t>
+            </w:r>
+          </w:p>
+        </w:tc>
+        <w:tc>
+          <w:tcPr/>
+          <w:p>
+            <w:pPr>
+              <w:pStyle w:val="Compact"/>
+              <w:jc w:val="both"/>
+            </w:pPr>
+            <w:r>
+              <w:rPr>
+                <w:rFonts w:ascii="Calibri" w:hAnsi="Calibri"/>
+                <w:sz w:val="18"/>
+              </w:rPr>
+              <w:t xml:space="preserve">2503. A organização executa processo para classificação e tratamento de informações.</w:t>
+            </w:r>
+          </w:p>
+        </w:tc>
+        <w:tc>
+          <w:tcPr/>
+          <w:p>
+            <w:pPr>
+              <w:pStyle w:val="Compact"/>
+              <w:jc w:val="both"/>
+            </w:pPr>
+            <w:r>
+              <w:rPr>
+                <w:rFonts w:ascii="Calibri" w:hAnsi="Calibri"/>
+                <w:sz w:val="18"/>
+              </w:rPr>
+              <w:t xml:space="preserve">0,124</w:t>
+            </w:r>
+          </w:p>
+        </w:tc>
+        <w:tc>
+          <w:tcPr/>
+          <w:p>
+            <w:pPr>
+              <w:pStyle w:val="Compact"/>
+              <w:jc w:val="both"/>
+            </w:pPr>
+            <w:r>
+              <w:rPr>
+                <w:rFonts w:ascii="Calibri" w:hAnsi="Calibri"/>
+                <w:sz w:val="18"/>
+              </w:rPr>
+              <w:t xml:space="preserve">1</w:t>
+            </w:r>
+          </w:p>
+        </w:tc>
+      </w:tr>
+      <w:tr>
+        <w:trPr>
+          <w:cantSplit/>
+        </w:trPr>
+        <w:tc>
+          <w:tcPr/>
+          <w:p>
+            <w:pPr>
+              <w:pStyle w:val="Compact"/>
+              <w:jc w:val="both"/>
+            </w:pPr>
+            <w:r>
+              <w:rPr>
+                <w:rFonts w:ascii="Calibri" w:hAnsi="Calibri"/>
+                <w:sz w:val="18"/>
+              </w:rPr>
+              <w:t xml:space="preserve">Menor adoção</w:t>
+            </w:r>
+          </w:p>
+        </w:tc>
+        <w:tc>
+          <w:tcPr/>
+          <w:p>
+            <w:pPr>
+              <w:pStyle w:val="Compact"/>
+              <w:jc w:val="both"/>
+            </w:pPr>
+            <w:r>
+              <w:rPr>
+                <w:rFonts w:ascii="Calibri" w:hAnsi="Calibri"/>
+                <w:sz w:val="18"/>
+              </w:rPr>
+              <w:t xml:space="preserve">1002. A alta administração monitora o desempenho da gestão de tecnologia da informação.</w:t>
+            </w:r>
+          </w:p>
+        </w:tc>
+        <w:tc>
+          <w:tcPr/>
+          <w:p>
+            <w:pPr>
+              <w:pStyle w:val="Compact"/>
+              <w:jc w:val="both"/>
+            </w:pPr>
+            <w:r>
+              <w:rPr>
+                <w:rFonts w:ascii="Calibri" w:hAnsi="Calibri"/>
+                <w:sz w:val="18"/>
+              </w:rPr>
+              <w:t xml:space="preserve">0,127</w:t>
+            </w:r>
+          </w:p>
+        </w:tc>
+        <w:tc>
+          <w:tcPr/>
+          <w:p>
+            <w:pPr>
+              <w:pStyle w:val="Compact"/>
+              <w:jc w:val="both"/>
+            </w:pPr>
+            <w:r>
+              <w:rPr>
+                <w:rFonts w:ascii="Calibri" w:hAnsi="Calibri"/>
+                <w:sz w:val="18"/>
+              </w:rPr>
+              <w:t xml:space="preserve">1</w:t>
+            </w:r>
+          </w:p>
+        </w:tc>
+      </w:tr>
+      <w:tr>
+        <w:trPr>
+          <w:cantSplit/>
+        </w:trPr>
+        <w:tc>
+          <w:tcPr/>
+          <w:p>
+            <w:pPr>
+              <w:pStyle w:val="Compact"/>
               <w:keepNext/>
               <w:jc w:val="both"/>
             </w:pPr>
             <w:r>
               <w:rPr>
                 <w:rFonts w:ascii="Calibri" w:hAnsi="Calibri"/>
-                <w:sz w:val="20"/>
-              </w:rPr>
-              <w:t xml:space="preserve">Grupo</w:t>
+                <w:sz w:val="18"/>
+              </w:rPr>
+              <w:t xml:space="preserve">Menor adoção</w:t>
             </w:r>
           </w:p>
         </w:tc>
@@ -5694,9 +6586,9 @@
             <w:r>
               <w:rPr>
                 <w:rFonts w:ascii="Calibri" w:hAnsi="Calibri"/>
-                <w:sz w:val="20"/>
-              </w:rPr>
-              <w:t xml:space="preserve">Prática</w:t>
+                <w:sz w:val="18"/>
+              </w:rPr>
+              <w:t xml:space="preserve">2203. A organização executa processo de gestão de configuração e ativos (de serviços de tecnologia da informação).</w:t>
             </w:r>
           </w:p>
         </w:tc>
@@ -5711,9 +6603,9 @@
             <w:r>
               <w:rPr>
                 <w:rFonts w:ascii="Calibri" w:hAnsi="Calibri"/>
-                <w:sz w:val="20"/>
-              </w:rPr>
-              <w:t xml:space="preserve">Média</w:t>
+                <w:sz w:val="18"/>
+              </w:rPr>
+              <w:t xml:space="preserve">0,142</w:t>
             </w:r>
           </w:p>
         </w:tc>
@@ -5728,9 +6620,9 @@
             <w:r>
               <w:rPr>
                 <w:rFonts w:ascii="Calibri" w:hAnsi="Calibri"/>
-                <w:sz w:val="20"/>
-              </w:rPr>
-              <w:t xml:space="preserve">Não se aplica</w:t>
+                <w:sz w:val="18"/>
+              </w:rPr>
+              <w:t xml:space="preserve">3</w:t>
             </w:r>
           </w:p>
         </w:tc>
@@ -5773,7 +6665,7 @@
         <w:pStyle w:val="Corpodetexto"/>
       </w:pPr>
       <w:r>
-        <w:t xml:space="preserve">O contraste sugere que instrumentos formais, como política e plano de TIC, estão relativamente mais disseminados do que práticas que exigem execução contínua, acompanhamento da alta administração, avaliação independente e manutenção sistemática de informações operacionais. Esse resultado reforça o diagnóstico de que o principal desafio não se limita à elaboração de documentos, mas envolve sua utilização efetiva para dirigir, monitorar e controlar a TIC.</w:t>
+        <w:t xml:space="preserve">O contraste sugere que instrumentos formais, como política e plano de TIC, estão relativamente mais disseminados do que práticas que exigem execução contínua, acompanhamento da alta administração, avaliação independente e manutenção sistemática de informações operacionais. Esse resultado reforça o diagnóstico de que o principal desafio não se limita à elaboração de documentos, mas envolve a demonstração documental de sua utilização regular para dirigir, monitorar e controlar a TIC.</w:t>
       </w:r>
     </w:p>
     <w:bookmarkEnd w:id="77"/>
@@ -8428,16 +9320,7 @@
         <w:pStyle w:val="Corpodetexto"/>
       </w:pPr>
       <w:r>
-        <w:t xml:space="preserve">A análise detalhada consta no anexo</w:t>
-      </w:r>
-      <w:r>
-        <w:t xml:space="preserve"> </w:t>
-      </w:r>
-      <w:r>
-        <w:t xml:space="preserve">“AN09 – Cenário de utilização de IA no ERJ”</w:t>
-      </w:r>
-      <w:r>
-        <w:t xml:space="preserve">.</w:t>
+        <w:t xml:space="preserve">A análise detalhada consta do Anexo AN09 – Cenário de utilização de IA no ERJ.</w:t>
       </w:r>
     </w:p>
     <w:bookmarkEnd w:id="109"/>
@@ -8463,7 +9346,7 @@
         <w:pStyle w:val="Corpodetexto"/>
       </w:pPr>
       <w:r>
-        <w:t xml:space="preserve">A comunicação inicial ocorreu mediante envio do ofício de apresentação e do TSID 1, oportunidade em que as organizações indicaram seus pontos focais para interlocução com a Equipe de Auditoria. Posteriormente, o TSID 2, contendo o link individualizado para preenchimento do questionário, foi encaminhado aos pontos focais indicados. Apesar das reiterações realizadas pela Equipe, não foi apresentada resposta válida ao instrumento. Em 23/6/2026, o ponto focal da EMOP solicitou a reabertura do questionário e informou ter estado ausente por problemas de saúde, circunstância que deve ser considerada na apuração individualizada.</w:t>
+        <w:t xml:space="preserve">A comunicação inicial ocorreu mediante envio do ofício de apresentação e do TSID 1, oportunidade em que todas as organizações indicaram seus pontos focais para interlocução com a Equipe de Auditoria. Posteriormente, o TSID 2, contendo o link individualizado para preenchimento do questionário, foi encaminhado aos pontos focais indicados. Apesar das reiterações realizadas pela Equipe, não foi apresentada resposta válida ao instrumento. Em 23/6/2026, o ponto focal da EMOP solicitou a reabertura do questionário e informou ter estado ausente por problemas de saúde, circunstância que deve ser considerada na apuração individualizada.</w:t>
       </w:r>
     </w:p>
     <w:p>
@@ -8479,7 +9362,7 @@
         <w:pStyle w:val="Corpodetexto"/>
       </w:pPr>
       <w:r>
-        <w:t xml:space="preserve">Os registros de envio, ciência e recebimento das comunicações, com indicação de data e hora, encontram-se reunidos no Anexo AN10 – Comunicações da fiscalização e registros de ciência. Em conjunto com a exportação integral da coleta, esses elementos justificam a abertura de processos apartados para apuração individualizada das circunstâncias da ausência de resposta válida, assegurando-se aos responsáveis a oportunidade de apresentar razões de defesa. A documentação demonstra a ausência de submissão válida, mas não basta, isoladamente, para caracterizar obstrução ou sonegação de informações. A proposta constante do capítulo 7 não pressupõe reconhecimento antecipado de responsabilidade nem aplicação automática de sanção.</w:t>
+        <w:t xml:space="preserve">Os registros de envio, ciência e recebimento das comunicações, com indicação de data e hora, encontram-se reunidos no Anexo AN10 – Comunicações da fiscalização e registros de ciência. Em conjunto com os registros das respostas coletadas, esses elementos justificam a abertura de processos apartados para apuração individualizada das circunstâncias da ausência de resposta válida, assegurando-se aos responsáveis a oportunidade de apresentar razões de defesa. A documentação demonstra a ausência de submissão válida, mas não basta, isoladamente, para caracterizar obstrução ou sonegação de informações. A proposta constante do capítulo 7 não pressupõe reconhecimento antecipado de responsabilidade nem aplicação automática de sanção.</w:t>
       </w:r>
     </w:p>
     <w:p>
@@ -8519,7 +9402,7 @@
         <w:pStyle w:val="Corpodetexto"/>
       </w:pPr>
       <w:r>
-        <w:t xml:space="preserve">As manifestações foram confrontadas com os critérios aplicáveis e o conjunto probatório de evidências enviadas. Todas as manifestações recebidas foram examinadas.</w:t>
+        <w:t xml:space="preserve">As submissões válidas recebidas pelo questionário eletrônico foram classificadas e consideradas na consolidação estatística. A manifestação da SESP, recebida por e-mail, foi examinada qualitativamente, como informado na Seção 5.1. A avaliação técnica individualizada e o exame dos documentos apresentados concentraram-se nas discordâncias, nas declarações de atendimento concluído e nos pedidos de reavaliação de evidências, conforme a metodologia descrita nesta seção.</w:t>
       </w:r>
     </w:p>
     <w:bookmarkStart w:id="118" w:name="participação-e-panorama-geral"/>
@@ -10357,7 +11240,7 @@
         <w:pStyle w:val="Corpodetexto"/>
       </w:pPr>
       <w:r>
-        <w:t xml:space="preserve">A análise técnica deve distinguir a existência formal dos mecanismos de governança de sua atuação efetiva. Atos de instituição ou designação, desacompanhados de registros de deliberações, priorização, acompanhamento e responsabilização, não comprovam necessariamente o funcionamento regular da governança de TIC.</w:t>
+        <w:t xml:space="preserve">A análise técnica distinguiu a existência formal dos mecanismos de governança de sua atuação documentalmente demonstrada. Atos de instituição ou designação, desacompanhados de registros de deliberações, priorização, acompanhamento e responsabilização, não comprovaram o funcionamento regular da governança de TIC.</w:t>
       </w:r>
     </w:p>
     <w:bookmarkEnd w:id="129"/>
@@ -10539,7 +11422,7 @@
         <w:pStyle w:val="Corpodetexto"/>
       </w:pPr>
       <w:r>
-        <w:t xml:space="preserve">Estudos de dimensionamento e atos de atribuição de cargos ou funções à TIC e à segurança da informação devem ser examinados quanto à vigência, abrangência e aplicação. Alegações de escassez de pessoal, ausência de cargos especializados ou restrição orçamentária contextualizam as dificuldades enfrentadas, mas não afastam automaticamente a insuficiência de capacidade institucional.</w:t>
+        <w:t xml:space="preserve">Os estudos de dimensionamento e os atos de atribuição de cargos ou funções à TIC e à segurança da informação foram examinados quanto à vigência, à abrangência e à aplicação. As alegações de escassez de pessoal, ausência de cargos especializados ou restrição orçamentária contextualizaram as dificuldades enfrentadas, mas não afastaram automaticamente a insuficiência de capacidade institucional.</w:t>
       </w:r>
     </w:p>
     <w:bookmarkEnd w:id="137"/>
@@ -10630,7 +11513,7 @@
         <w:pStyle w:val="Corpodetexto"/>
       </w:pPr>
       <w:r>
-        <w:t xml:space="preserve">Catálogos de serviços, inventários, registros de configuração, definições de níveis de serviço e registros de incidentes devem demonstrar formalização, atualização, abrangência e uso efetivo. Relações incompletas de ativos, controles informais ou documentos sem data e responsabilidade definida devem ser avaliados com cautela, pois podem demonstrar atividade parcial sem comprovar o processo requerido.</w:t>
+        <w:t xml:space="preserve">Os catálogos de serviços, inventários, registros de configuração, definições de níveis de serviço e registros de incidentes foram examinados quanto à formalização, à atualização, à abrangência e ao uso regularmente demonstrado. Relações incompletas de ativos, controles informais ou documentos sem data e responsabilidade definida foram avaliados com cautela, pois podem demonstrar atividade parcial sem comprovar o processo requerido.</w:t>
       </w:r>
     </w:p>
     <w:bookmarkEnd w:id="141"/>
@@ -10721,7 +11604,7 @@
         <w:pStyle w:val="Corpodetexto"/>
       </w:pPr>
       <w:r>
-        <w:t xml:space="preserve">A análise das discordâncias deve verificar se as contratações de TIC foram submetidas a processo padronizado e proporcional ao risco, à complexidade e ao valor, com participação da área técnica e vínculo demonstrado com o planejamento de TIC e o Plano de Contratações Anual. A regularidade formal do procedimento licitatório, isoladamente, não comprova a suficiência da governança técnica da contratação de TIC.</w:t>
+        <w:t xml:space="preserve">A análise das discordâncias verificou se as contratações de TIC foram submetidas a processo padronizado e proporcional ao risco, à complexidade e ao valor, com participação da área técnica e vínculo demonstrado com o planejamento de TIC e o Plano de Contratações Anual. A regularidade formal do procedimento licitatório, isoladamente, não comprovou a suficiência da governança técnica da contratação de TIC.</w:t>
       </w:r>
     </w:p>
     <w:bookmarkEnd w:id="145"/>
@@ -10951,7 +11834,7 @@
                 <w:rFonts w:ascii="Calibri" w:hAnsi="Calibri"/>
                 <w:sz w:val="18"/>
               </w:rPr>
-              <w:t xml:space="preserve">Q2504</w:t>
+              <w:t xml:space="preserve">2504</w:t>
             </w:r>
           </w:p>
         </w:tc>
@@ -11036,7 +11919,7 @@
                 <w:rFonts w:ascii="Calibri" w:hAnsi="Calibri"/>
                 <w:sz w:val="18"/>
               </w:rPr>
-              <w:t xml:space="preserve">Q2802</w:t>
+              <w:t xml:space="preserve">2802</w:t>
             </w:r>
           </w:p>
         </w:tc>
@@ -11121,7 +12004,7 @@
                 <w:rFonts w:ascii="Calibri" w:hAnsi="Calibri"/>
                 <w:sz w:val="18"/>
               </w:rPr>
-              <w:t xml:space="preserve">Q2708</w:t>
+              <w:t xml:space="preserve">2708</w:t>
             </w:r>
           </w:p>
         </w:tc>
@@ -11206,7 +12089,7 @@
                 <w:rFonts w:ascii="Calibri" w:hAnsi="Calibri"/>
                 <w:sz w:val="18"/>
               </w:rPr>
-              <w:t xml:space="preserve">Q2801</w:t>
+              <w:t xml:space="preserve">2801</w:t>
             </w:r>
           </w:p>
         </w:tc>
@@ -11291,7 +12174,7 @@
                 <w:rFonts w:ascii="Calibri" w:hAnsi="Calibri"/>
                 <w:sz w:val="18"/>
               </w:rPr>
-              <w:t xml:space="preserve">Q2804</w:t>
+              <w:t xml:space="preserve">2804</w:t>
             </w:r>
           </w:p>
         </w:tc>
@@ -11376,7 +12259,7 @@
                 <w:rFonts w:ascii="Calibri" w:hAnsi="Calibri"/>
                 <w:sz w:val="18"/>
               </w:rPr>
-              <w:t xml:space="preserve">Q2102</w:t>
+              <w:t xml:space="preserve">2102</w:t>
             </w:r>
           </w:p>
         </w:tc>
@@ -11461,7 +12344,7 @@
                 <w:rFonts w:ascii="Calibri" w:hAnsi="Calibri"/>
                 <w:sz w:val="18"/>
               </w:rPr>
-              <w:t xml:space="preserve">Q2201</w:t>
+              <w:t xml:space="preserve">2201</w:t>
             </w:r>
           </w:p>
         </w:tc>
@@ -11546,7 +12429,7 @@
                 <w:rFonts w:ascii="Calibri" w:hAnsi="Calibri"/>
                 <w:sz w:val="18"/>
               </w:rPr>
-              <w:t xml:space="preserve">Q2501</w:t>
+              <w:t xml:space="preserve">2501</w:t>
             </w:r>
           </w:p>
         </w:tc>
@@ -11631,7 +12514,7 @@
                 <w:rFonts w:ascii="Calibri" w:hAnsi="Calibri"/>
                 <w:sz w:val="18"/>
               </w:rPr>
-              <w:t xml:space="preserve">Q2701</w:t>
+              <w:t xml:space="preserve">2701</w:t>
             </w:r>
           </w:p>
         </w:tc>
@@ -11716,7 +12599,7 @@
                 <w:rFonts w:ascii="Calibri" w:hAnsi="Calibri"/>
                 <w:sz w:val="18"/>
               </w:rPr>
-              <w:t xml:space="preserve">Q0103</w:t>
+              <w:t xml:space="preserve">0103</w:t>
             </w:r>
           </w:p>
         </w:tc>
@@ -11801,7 +12684,7 @@
                 <w:rFonts w:ascii="Calibri" w:hAnsi="Calibri"/>
                 <w:sz w:val="18"/>
               </w:rPr>
-              <w:t xml:space="preserve">Q1001</w:t>
+              <w:t xml:space="preserve">1001</w:t>
             </w:r>
           </w:p>
         </w:tc>
@@ -11887,7 +12770,7 @@
                 <w:rFonts w:ascii="Calibri" w:hAnsi="Calibri"/>
                 <w:sz w:val="18"/>
               </w:rPr>
-              <w:t xml:space="preserve">Q2702</w:t>
+              <w:t xml:space="preserve">2702</w:t>
             </w:r>
           </w:p>
         </w:tc>
@@ -11992,7 +12875,7 @@
         <w:pStyle w:val="FirstParagraph"/>
       </w:pPr>
       <w:r>
-        <w:t xml:space="preserve">Na primeira seção, 261 manifestações demandaram avaliação individualizada: as 236 discordâncias e as 25 declarações de atendimento concluído. Desse conjunto, 46 foram acolhidas integralmente, seis foram parcialmente acolhidas e alteraram parte dos fundamentos, e 209 não foram acolhidas. As demais manifestações de concordância sem atendimento concluído não tiveram os eventuais anexos avaliados.</w:t>
+        <w:t xml:space="preserve">Na primeira seção, 261 manifestações demandaram avaliação individualizada: as 236 discordâncias e as 25 declarações de atendimento concluído. Desse conjunto, 46 foram acolhidas integralmente, seis foram parcialmente acolhidas e alteraram parte dos fundamentos, e 209 não foram acolhidas. As demais manifestações de concordância sem atendimento concluído não integraram o universo de avaliação técnica individualizada, e seus eventuais anexos não foram utilizados para alterar as conclusões.</w:t>
       </w:r>
     </w:p>
     <w:p>
@@ -12971,16 +13854,7 @@
         <w:pStyle w:val="Corpodetexto"/>
       </w:pPr>
       <w:r>
-        <w:t xml:space="preserve">As providências em curso e as correções posteriores também fornecem subsídios para os planos de ação. Seu acompanhamento deverá verificar responsáveis, prazos, abrangência e evidências de implementação efetiva. A metodologia, a participação, as razões de não acolhimento e a memória detalhada dos impactos constam do Anexo</w:t>
-      </w:r>
-      <w:r>
-        <w:t xml:space="preserve"> </w:t>
-      </w:r>
-      <w:r>
-        <w:t xml:space="preserve">“AN08 – Avaliação dos comentários do gestor”</w:t>
-      </w:r>
-      <w:r>
-        <w:t xml:space="preserve">.</w:t>
+        <w:t xml:space="preserve">As providências em curso e as correções posteriores também fornecem subsídios para os planos de ação. Seu acompanhamento deverá verificar responsáveis, prazos, abrangência e evidências de implementação efetiva. A metodologia, a participação, as razões de não acolhimento e a memória detalhada dos impactos constam do Anexo AN08 – Avaliação dos comentários do gestor.</w:t>
       </w:r>
     </w:p>
     <w:p>
@@ -13036,7 +13910,7 @@
         <w:pStyle w:val="Corpodetexto"/>
       </w:pPr>
       <w:r>
-        <w:t xml:space="preserve">Os procedimentos de auditoria confirmaram a materialidade das fragilidades apontadas pelo índice. Foram consolidados seis achados, relacionados à estrutura de TIC, governança de TIC, planejamento de TIC, capacidade institucional, gestão de serviços de TIC e contratações de TIC. Em todos esses temas, verificou-se incidência expressiva de situações inconformes, com destaque para fragilidades na definição de papéis e responsabilidades, na atuação da alta administração, na integração entre planejamento, orçamento e contratações, no dimensionamento da força de trabalho, na atribuição formal de funções e na preservação de capacidade interna, no controle de serviços, ativos e incidentes e na governança técnica das aquisições de tecnologia.</w:t>
+        <w:t xml:space="preserve">Os procedimentos de auditoria detalharam e individualizaram as fragilidades indicadas pelo índice. Foram consolidados seis achados, relacionados à estrutura de TIC, governança de TIC, planejamento de TIC, capacidade institucional, gestão de serviços de TIC e contratações de TIC. Em todos esses temas, verificou-se incidência expressiva de situações inconformes, com destaque para fragilidades na definição de papéis e responsabilidades, na atuação da alta administração, na integração entre planejamento, orçamento e contratações, no dimensionamento da força de trabalho, na atribuição formal de funções e na preservação de capacidade interna, no controle de serviços, ativos e incidentes e na governança técnica das aquisições de tecnologia.</w:t>
       </w:r>
     </w:p>
     <w:p>
@@ -13217,7 +14091,7 @@
         <w:t xml:space="preserve"> </w:t>
       </w:r>
       <w:r>
-        <w:t xml:space="preserve">que a metodologia empregada neste trabalho não abordou as causas específicas dos problemas identificados e que as recomendações focam na implementação de medidas de governança e gestão de TIC baseadas no COBIT 2019 e no ITIL 4, conforme os critérios e referenciais adotados na auditoria;</w:t>
+        <w:t xml:space="preserve">que a metodologia empregada neste trabalho não abordou as causas específicas dos problemas identificados e que as determinações e recomendações propostas se fundamentam nos critérios legais, jurisprudenciais e técnicos sintetizados na Seção 2.4 e individualizados nos relatórios das organizações avaliadas;</w:t>
       </w:r>
     </w:p>
     <w:p>
@@ -13721,7 +14595,7 @@
         <w:t xml:space="preserve">NOTIFICAÇÃO</w:t>
       </w:r>
       <w:r>
-        <w:t xml:space="preserve">, nos termos regimentais, para que os respectivos responsáveis apresentem razões de defesa. Na instrução, deverão ser considerados os registros do Anexo AN10, a resposta parcial e o pedido de reabertura apresentados pela EMOP, os esclarecimentos e o Ofício SESP-GABSEC nº 1.067 encaminhados pela SESP e os demais elementos individualizados, avaliando-se, somente se comprovada a conduta correspondente, a incidência do art. 63, incisos V ou VI, da Lei Complementar Estadual n.º 63/1990;</w:t>
+        <w:t xml:space="preserve">, nos termos regimentais, para que os respectivos responsáveis apresentem razões de defesa. Na instrução, deverão ser considerados os registros do Anexo AN10, a resposta parcial e o pedido de reabertura apresentados pela EMOP, os esclarecimentos e o Ofício SESP-GABSEC nº 1.067 encaminhados pela SESP e os demais elementos individualizados, avaliando-se, somente se comprovada a conduta correspondente, a incidência do art. 63, incisos V ou VI, da Lei Complementar Estadual nº 63/1990;</w:t>
       </w:r>
     </w:p>
     <w:p>
@@ -14364,16 +15238,7 @@
         <w:t xml:space="preserve"> </w:t>
       </w:r>
       <w:r>
-        <w:t xml:space="preserve">A comparação considerou a base após os ajustes iniciais de saneamento e a base resultante da avaliação das evidências. Foram efetivamente alteradas 1.964 células de respostas de 103 organizações. A análise detalhada consta do Anexo</w:t>
-      </w:r>
-      <w:r>
-        <w:t xml:space="preserve"> </w:t>
-      </w:r>
-      <w:r>
-        <w:t xml:space="preserve">“AN07 – Impacto da avaliação das evidências”</w:t>
-      </w:r>
-      <w:r>
-        <w:t xml:space="preserve">.</w:t>
+        <w:t xml:space="preserve">A comparação considerou a base após os ajustes iniciais de saneamento e a base resultante da avaliação das evidências. Foram efetivamente alteradas 1.964 células de respostas de 103 organizações. A análise detalhada consta do Anexo AN07 – Impacto da avaliação das evidências.</w:t>
       </w:r>
     </w:p>
   </w:footnote>
@@ -14392,16 +15257,7 @@
         <w:t xml:space="preserve"> </w:t>
       </w:r>
       <w:r>
-        <w:t xml:space="preserve">Na execução dos procedimentos de auditoria sobre a base pós-avaliação de evidências, foram registradas 602 marcações de achados por auditado e 1.458 situações inconformes. A metodologia, os resultados por organização e as limitações da comparação constam do Anexo</w:t>
-      </w:r>
-      <w:r>
-        <w:t xml:space="preserve"> </w:t>
-      </w:r>
-      <w:r>
-        <w:t xml:space="preserve">“AN07 – Impacto da avaliação das evidências”</w:t>
-      </w:r>
-      <w:r>
-        <w:t xml:space="preserve">.</w:t>
+        <w:t xml:space="preserve">Na execução dos procedimentos de auditoria sobre a base pós-avaliação de evidências, foram registradas 602 marcações de achados por auditado e 1.458 situações inconformes. A metodologia, os resultados por organização e as limitações da comparação constam do Anexo AN07 – Impacto da avaliação das evidências.</w:t>
       </w:r>
     </w:p>
   </w:footnote>

</xml_diff>